<commit_message>
Rendering works for two subdocs.
</commit_message>
<xml_diff>
--- a/resources/Templates/Base_Template.docx
+++ b/resources/Templates/Base_Template.docx
@@ -996,18 +996,6 @@
     </w:p>
     <w:p>
       <w:pPr>
-        <w:tabs>
-          <w:tab w:val="left" w:pos="-1080"/>
-          <w:tab w:val="left" w:pos="-720"/>
-          <w:tab w:val="left" w:pos="0"/>
-          <w:tab w:val="left" w:pos="720"/>
-          <w:tab w:val="left" w:pos="1440"/>
-          <w:tab w:val="left" w:pos="2160"/>
-          <w:tab w:val="left" w:pos="2880"/>
-          <w:tab w:val="left" w:pos="3600"/>
-          <w:tab w:val="left" w:pos="4320"/>
-          <w:tab w:val="left" w:pos="4680"/>
-        </w:tabs>
         <w:rPr>
           <w:rFonts w:ascii="Palatino Linotype" w:hAnsi="Palatino Linotype"/>
           <w:sz w:val="16"/>
@@ -1020,89 +1008,17 @@
           <w:sz w:val="16"/>
           <w:szCs w:val="16"/>
         </w:rPr>
-        <w:t>Copies served by Dep. Clerk ___________________________ on the following date ____________________ to:</w:t>
-      </w:r>
-    </w:p>
-    <w:p>
-      <w:pPr>
-        <w:tabs>
-          <w:tab w:val="left" w:pos="-1080"/>
-          <w:tab w:val="left" w:pos="-720"/>
-          <w:tab w:val="left" w:pos="0"/>
-          <w:tab w:val="left" w:pos="720"/>
-          <w:tab w:val="left" w:pos="1440"/>
-          <w:tab w:val="left" w:pos="2160"/>
-          <w:tab w:val="left" w:pos="2880"/>
-          <w:tab w:val="left" w:pos="3600"/>
-          <w:tab w:val="left" w:pos="4320"/>
-          <w:tab w:val="left" w:pos="4680"/>
-        </w:tabs>
+        <w:t>{{</w:t>
+      </w:r>
+      <w:r>
         <w:rPr>
           <w:rFonts w:ascii="Palatino Linotype" w:hAnsi="Palatino Linotype"/>
           <w:sz w:val="16"/>
           <w:szCs w:val="16"/>
         </w:rPr>
-      </w:pPr>
-      <w:r>
-        <w:rPr>
-          <w:rFonts w:ascii="Palatino Linotype" w:hAnsi="Palatino Linotype"/>
-          <w:sz w:val="16"/>
-          <w:szCs w:val="16"/>
-        </w:rPr>
-        <w:t>Prosecutor’s Office: PS    OM     EM; Defendant’s Attorney: PS     OM     EM; {{ defendant.first_name }} {{ defendant.last_name}}: PS     OM     EM;</w:t>
+        <w:t xml:space="preserve"> service_subdoc }}</w:t>
       </w:r>
     </w:p>
-    <w:p>
-      <w:pPr>
-        <w:tabs>
-          <w:tab w:val="left" w:pos="-1080"/>
-          <w:tab w:val="left" w:pos="-720"/>
-          <w:tab w:val="left" w:pos="0"/>
-          <w:tab w:val="left" w:pos="720"/>
-          <w:tab w:val="left" w:pos="1440"/>
-          <w:tab w:val="left" w:pos="2160"/>
-          <w:tab w:val="left" w:pos="2880"/>
-          <w:tab w:val="left" w:pos="3600"/>
-          <w:tab w:val="left" w:pos="4320"/>
-          <w:tab w:val="left" w:pos="4680"/>
-        </w:tabs>
-        <w:rPr>
-          <w:rFonts w:ascii="Palatino Linotype" w:hAnsi="Palatino Linotype"/>
-          <w:sz w:val="16"/>
-          <w:szCs w:val="16"/>
-        </w:rPr>
-      </w:pPr>
-      <w:r>
-        <w:rPr>
-          <w:rFonts w:ascii="Palatino Linotype" w:hAnsi="Palatino Linotype"/>
-          <w:sz w:val="16"/>
-          <w:szCs w:val="16"/>
-        </w:rPr>
-        <w:t>{% if community_control.ordered is true or bond_conditions.monitoring is true %}Community Control: PS    EM;{% endif %}{% if jail_terms.ordered is true or apply_jtc == ‘Sentence’ %}County Jail: PS   EM;{% endif %}</w:t>
-      </w:r>
-    </w:p>
-    <w:p>
-      <w:pPr>
-        <w:tabs>
-          <w:tab w:val="left" w:pos="-1080"/>
-          <w:tab w:val="left" w:pos="-720"/>
-          <w:tab w:val="left" w:pos="0"/>
-          <w:tab w:val="left" w:pos="720"/>
-          <w:tab w:val="left" w:pos="1440"/>
-          <w:tab w:val="left" w:pos="2160"/>
-          <w:tab w:val="left" w:pos="2880"/>
-          <w:tab w:val="left" w:pos="3600"/>
-          <w:tab w:val="left" w:pos="4320"/>
-          <w:tab w:val="left" w:pos="4680"/>
-        </w:tabs>
-        <w:rPr>
-          <w:rFonts w:ascii="Palatino Linotype" w:hAnsi="Palatino Linotype"/>
-          <w:sz w:val="16"/>
-          <w:szCs w:val="16"/>
-        </w:rPr>
-      </w:pPr>
-    </w:p>
-    <w:p/>
     <w:sectPr>
       <w:headerReference w:type="even" r:id="rId4"/>
       <w:headerReference w:type="default" r:id="rId5"/>

</xml_diff>

<commit_message>
Issue with caption subdoc and opening word.
</commit_message>
<xml_diff>
--- a/resources/Templates/Base_Template.docx
+++ b/resources/Templates/Base_Template.docx
@@ -16,45 +16,12 @@
           <w:tab w:val="left" w:pos="4320"/>
           <w:tab w:val="left" w:pos="4680"/>
         </w:tabs>
-        <w:ind w:left="4680" w:hanging="4680"/>
         <w:rPr>
           <w:rFonts w:ascii="Palatino Linotype" w:hAnsi="Palatino Linotype"/>
           <w:sz w:val="20"/>
           <w:szCs w:val="20"/>
         </w:rPr>
       </w:pPr>
-      <w:r>
-        <w:rPr>
-          <w:rFonts w:ascii="Palatino Linotype" w:hAnsi="Palatino Linotype"/>
-          <w:sz w:val="20"/>
-          <w:szCs w:val="20"/>
-        </w:rPr>
-        <w:t>State of Ohio</w:t>
-      </w:r>
-      <w:r>
-        <w:rPr>
-          <w:rFonts w:ascii="Palatino Linotype" w:hAnsi="Palatino Linotype"/>
-          <w:sz w:val="20"/>
-          <w:szCs w:val="20"/>
-        </w:rPr>
-        <w:t>,</w:t>
-      </w:r>
-      <w:r>
-        <w:rPr>
-          <w:rFonts w:ascii="Palatino Linotype" w:hAnsi="Palatino Linotype"/>
-          <w:sz w:val="20"/>
-          <w:szCs w:val="20"/>
-        </w:rPr>
-        <w:tab/>
-      </w:r>
-      <w:r>
-        <w:rPr>
-          <w:rFonts w:ascii="Palatino Linotype" w:hAnsi="Palatino Linotype"/>
-          <w:sz w:val="20"/>
-          <w:szCs w:val="20"/>
-        </w:rPr>
-        <w:tab/>
-      </w:r>
       <w:r>
         <w:rPr>
           <w:rFonts w:ascii="Palatino Linotype" w:hAnsi="Palatino Linotype"/>
@@ -86,7 +53,6 @@
           <w:tab w:val="left" w:pos="4320"/>
           <w:tab w:val="left" w:pos="4680"/>
         </w:tabs>
-        <w:ind w:left="4680" w:hanging="2520"/>
         <w:rPr>
           <w:rFonts w:ascii="Palatino Linotype" w:hAnsi="Palatino Linotype"/>
           <w:sz w:val="20"/>
@@ -99,372 +65,6 @@
           <w:sz w:val="20"/>
           <w:szCs w:val="20"/>
         </w:rPr>
-        <w:t>Plaintiff,</w:t>
-      </w:r>
-      <w:r>
-        <w:rPr>
-          <w:rFonts w:ascii="Palatino Linotype" w:hAnsi="Palatino Linotype"/>
-          <w:sz w:val="20"/>
-          <w:szCs w:val="20"/>
-        </w:rPr>
-        <w:tab/>
-      </w:r>
-      <w:r>
-        <w:rPr>
-          <w:rFonts w:ascii="Palatino Linotype" w:hAnsi="Palatino Linotype"/>
-          <w:sz w:val="20"/>
-          <w:szCs w:val="20"/>
-        </w:rPr>
-        <w:tab/>
-      </w:r>
-      <w:r>
-        <w:rPr>
-          <w:rFonts w:ascii="Palatino Linotype" w:hAnsi="Palatino Linotype"/>
-          <w:sz w:val="20"/>
-          <w:szCs w:val="20"/>
-        </w:rPr>
-        <w:tab/>
-      </w:r>
-    </w:p>
-    <w:p>
-      <w:pPr>
-        <w:tabs>
-          <w:tab w:val="left" w:pos="-1080"/>
-          <w:tab w:val="left" w:pos="-720"/>
-          <w:tab w:val="left" w:pos="0"/>
-          <w:tab w:val="left" w:pos="720"/>
-          <w:tab w:val="left" w:pos="1440"/>
-          <w:tab w:val="left" w:pos="2160"/>
-          <w:tab w:val="left" w:pos="2880"/>
-          <w:tab w:val="left" w:pos="3600"/>
-          <w:tab w:val="left" w:pos="4320"/>
-          <w:tab w:val="left" w:pos="4680"/>
-        </w:tabs>
-        <w:rPr>
-          <w:rFonts w:ascii="Palatino Linotype" w:hAnsi="Palatino Linotype"/>
-          <w:sz w:val="20"/>
-          <w:szCs w:val="20"/>
-        </w:rPr>
-      </w:pPr>
-    </w:p>
-    <w:p>
-      <w:pPr>
-        <w:tabs>
-          <w:tab w:val="left" w:pos="-1080"/>
-          <w:tab w:val="left" w:pos="-720"/>
-          <w:tab w:val="left" w:pos="0"/>
-          <w:tab w:val="left" w:pos="720"/>
-          <w:tab w:val="left" w:pos="1440"/>
-          <w:tab w:val="left" w:pos="2160"/>
-          <w:tab w:val="left" w:pos="2880"/>
-          <w:tab w:val="left" w:pos="3600"/>
-          <w:tab w:val="left" w:pos="4320"/>
-          <w:tab w:val="left" w:pos="4680"/>
-        </w:tabs>
-        <w:ind w:left="5760" w:hanging="4320"/>
-        <w:rPr>
-          <w:rFonts w:ascii="Palatino Linotype" w:hAnsi="Palatino Linotype"/>
-          <w:sz w:val="20"/>
-          <w:szCs w:val="20"/>
-        </w:rPr>
-      </w:pPr>
-      <w:r>
-        <w:rPr>
-          <w:rFonts w:ascii="Palatino Linotype" w:hAnsi="Palatino Linotype"/>
-          <w:sz w:val="20"/>
-          <w:szCs w:val="20"/>
-        </w:rPr>
-        <w:t>vs.</w:t>
-      </w:r>
-      <w:r>
-        <w:rPr>
-          <w:rFonts w:ascii="Palatino Linotype" w:hAnsi="Palatino Linotype"/>
-          <w:sz w:val="20"/>
-          <w:szCs w:val="20"/>
-        </w:rPr>
-        <w:tab/>
-      </w:r>
-      <w:r>
-        <w:rPr>
-          <w:rFonts w:ascii="Palatino Linotype" w:hAnsi="Palatino Linotype"/>
-          <w:sz w:val="20"/>
-          <w:szCs w:val="20"/>
-        </w:rPr>
-        <w:tab/>
-      </w:r>
-      <w:r>
-        <w:rPr>
-          <w:rFonts w:ascii="Palatino Linotype" w:hAnsi="Palatino Linotype"/>
-          <w:sz w:val="20"/>
-          <w:szCs w:val="20"/>
-        </w:rPr>
-        <w:tab/>
-      </w:r>
-      <w:r>
-        <w:rPr>
-          <w:rFonts w:ascii="Palatino Linotype" w:hAnsi="Palatino Linotype"/>
-          <w:sz w:val="20"/>
-          <w:szCs w:val="20"/>
-        </w:rPr>
-        <w:tab/>
-      </w:r>
-      <w:r>
-        <w:rPr>
-          <w:rFonts w:ascii="Palatino Linotype" w:hAnsi="Palatino Linotype"/>
-          <w:sz w:val="20"/>
-          <w:szCs w:val="20"/>
-        </w:rPr>
-        <w:tab/>
-        <w:t>C</w:t>
-      </w:r>
-      <w:r>
-        <w:rPr>
-          <w:rFonts w:ascii="Palatino Linotype" w:hAnsi="Palatino Linotype"/>
-          <w:sz w:val="20"/>
-          <w:szCs w:val="20"/>
-        </w:rPr>
-        <w:t>ase</w:t>
-      </w:r>
-      <w:r>
-        <w:rPr>
-          <w:rFonts w:ascii="Palatino Linotype" w:hAnsi="Palatino Linotype"/>
-          <w:sz w:val="20"/>
-          <w:szCs w:val="20"/>
-        </w:rPr>
-        <w:t xml:space="preserve"> N</w:t>
-      </w:r>
-      <w:r>
-        <w:rPr>
-          <w:rFonts w:ascii="Palatino Linotype" w:hAnsi="Palatino Linotype"/>
-          <w:sz w:val="20"/>
-          <w:szCs w:val="20"/>
-        </w:rPr>
-        <w:t>o</w:t>
-      </w:r>
-      <w:r>
-        <w:rPr>
-          <w:rFonts w:ascii="Palatino Linotype" w:hAnsi="Palatino Linotype"/>
-          <w:sz w:val="20"/>
-          <w:szCs w:val="20"/>
-        </w:rPr>
-        <w:t>.  {{ case_number }}</w:t>
-      </w:r>
-      <w:r>
-        <w:rPr>
-          <w:rFonts w:ascii="Palatino Linotype" w:hAnsi="Palatino Linotype"/>
-          <w:sz w:val="20"/>
-          <w:szCs w:val="20"/>
-        </w:rPr>
-        <w:tab/>
-      </w:r>
-      <w:r>
-        <w:rPr>
-          <w:rFonts w:ascii="Palatino Linotype" w:hAnsi="Palatino Linotype"/>
-          <w:sz w:val="20"/>
-          <w:szCs w:val="20"/>
-        </w:rPr>
-        <w:tab/>
-      </w:r>
-      <w:r>
-        <w:rPr>
-          <w:rFonts w:ascii="Palatino Linotype" w:hAnsi="Palatino Linotype"/>
-          <w:sz w:val="20"/>
-          <w:szCs w:val="20"/>
-        </w:rPr>
-        <w:tab/>
-      </w:r>
-      <w:r>
-        <w:rPr>
-          <w:rFonts w:ascii="Palatino Linotype" w:hAnsi="Palatino Linotype"/>
-          <w:sz w:val="20"/>
-          <w:szCs w:val="20"/>
-        </w:rPr>
-        <w:tab/>
-      </w:r>
-      <w:r>
-        <w:rPr>
-          <w:rFonts w:ascii="Palatino Linotype" w:hAnsi="Palatino Linotype"/>
-          <w:sz w:val="20"/>
-          <w:szCs w:val="20"/>
-        </w:rPr>
-        <w:tab/>
-      </w:r>
-      <w:r>
-        <w:rPr>
-          <w:rFonts w:ascii="Palatino Linotype" w:hAnsi="Palatino Linotype"/>
-          <w:sz w:val="20"/>
-          <w:szCs w:val="20"/>
-        </w:rPr>
-        <w:tab/>
-        <w:t xml:space="preserve">    </w:t>
-      </w:r>
-    </w:p>
-    <w:p>
-      <w:pPr>
-        <w:tabs>
-          <w:tab w:val="left" w:pos="-1080"/>
-          <w:tab w:val="left" w:pos="-720"/>
-          <w:tab w:val="left" w:pos="0"/>
-          <w:tab w:val="left" w:pos="720"/>
-          <w:tab w:val="left" w:pos="1440"/>
-          <w:tab w:val="left" w:pos="2160"/>
-          <w:tab w:val="left" w:pos="2880"/>
-          <w:tab w:val="left" w:pos="3600"/>
-          <w:tab w:val="left" w:pos="4320"/>
-          <w:tab w:val="left" w:pos="4680"/>
-        </w:tabs>
-        <w:ind w:left="4680" w:hanging="4680"/>
-        <w:rPr>
-          <w:rFonts w:ascii="Palatino Linotype" w:hAnsi="Palatino Linotype"/>
-          <w:sz w:val="20"/>
-          <w:szCs w:val="20"/>
-        </w:rPr>
-      </w:pPr>
-      <w:r>
-        <w:rPr>
-          <w:rFonts w:ascii="Palatino Linotype" w:hAnsi="Palatino Linotype"/>
-          <w:sz w:val="20"/>
-          <w:szCs w:val="20"/>
-        </w:rPr>
-        <w:t>{{ defendant.</w:t>
-      </w:r>
-      <w:r>
-        <w:rPr>
-          <w:rFonts w:ascii="Palatino Linotype" w:hAnsi="Palatino Linotype"/>
-          <w:sz w:val="20"/>
-          <w:szCs w:val="20"/>
-        </w:rPr>
-        <w:t>first_name }}</w:t>
-      </w:r>
-      <w:r>
-        <w:rPr>
-          <w:rFonts w:ascii="Palatino Linotype" w:hAnsi="Palatino Linotype"/>
-          <w:sz w:val="20"/>
-          <w:szCs w:val="20"/>
-        </w:rPr>
-        <w:t xml:space="preserve"> {{ defendant.</w:t>
-      </w:r>
-      <w:r>
-        <w:rPr>
-          <w:rFonts w:ascii="Palatino Linotype" w:hAnsi="Palatino Linotype"/>
-          <w:sz w:val="20"/>
-          <w:szCs w:val="20"/>
-        </w:rPr>
-        <w:t>last_name }},</w:t>
-      </w:r>
-      <w:r>
-        <w:rPr>
-          <w:rFonts w:ascii="Palatino Linotype" w:hAnsi="Palatino Linotype"/>
-          <w:sz w:val="20"/>
-          <w:szCs w:val="20"/>
-        </w:rPr>
-        <w:tab/>
-      </w:r>
-      <w:r>
-        <w:rPr>
-          <w:rFonts w:ascii="Palatino Linotype" w:hAnsi="Palatino Linotype"/>
-          <w:sz w:val="20"/>
-          <w:szCs w:val="20"/>
-        </w:rPr>
-        <w:tab/>
-      </w:r>
-      <w:r>
-        <w:rPr>
-          <w:rFonts w:ascii="Palatino Linotype" w:hAnsi="Palatino Linotype"/>
-          <w:sz w:val="20"/>
-          <w:szCs w:val="20"/>
-        </w:rPr>
-        <w:tab/>
-      </w:r>
-      <w:r>
-        <w:rPr>
-          <w:rFonts w:ascii="Palatino Linotype" w:hAnsi="Palatino Linotype"/>
-          <w:sz w:val="20"/>
-          <w:szCs w:val="20"/>
-        </w:rPr>
-        <w:tab/>
-      </w:r>
-    </w:p>
-    <w:p>
-      <w:pPr>
-        <w:tabs>
-          <w:tab w:val="left" w:pos="-1080"/>
-          <w:tab w:val="left" w:pos="-720"/>
-          <w:tab w:val="left" w:pos="0"/>
-          <w:tab w:val="left" w:pos="720"/>
-          <w:tab w:val="left" w:pos="1440"/>
-          <w:tab w:val="left" w:pos="2160"/>
-          <w:tab w:val="left" w:pos="2880"/>
-          <w:tab w:val="left" w:pos="3600"/>
-          <w:tab w:val="left" w:pos="4320"/>
-          <w:tab w:val="left" w:pos="4680"/>
-        </w:tabs>
-        <w:ind w:left="4680" w:hanging="2520"/>
-        <w:rPr>
-          <w:rFonts w:ascii="Palatino Linotype" w:hAnsi="Palatino Linotype"/>
-          <w:sz w:val="20"/>
-          <w:szCs w:val="20"/>
-        </w:rPr>
-      </w:pPr>
-      <w:r>
-        <w:rPr>
-          <w:rFonts w:ascii="Palatino Linotype" w:hAnsi="Palatino Linotype"/>
-          <w:sz w:val="20"/>
-          <w:szCs w:val="20"/>
-        </w:rPr>
-        <w:t>Defendant.</w:t>
-      </w:r>
-      <w:r>
-        <w:rPr>
-          <w:rFonts w:ascii="Palatino Linotype" w:hAnsi="Palatino Linotype"/>
-          <w:sz w:val="20"/>
-          <w:szCs w:val="20"/>
-        </w:rPr>
-        <w:tab/>
-      </w:r>
-      <w:r>
-        <w:rPr>
-          <w:rFonts w:ascii="Palatino Linotype" w:hAnsi="Palatino Linotype"/>
-          <w:sz w:val="20"/>
-          <w:szCs w:val="20"/>
-        </w:rPr>
-        <w:tab/>
-      </w:r>
-      <w:r>
-        <w:rPr>
-          <w:rFonts w:ascii="Palatino Linotype" w:hAnsi="Palatino Linotype"/>
-          <w:sz w:val="20"/>
-          <w:szCs w:val="20"/>
-        </w:rPr>
-        <w:tab/>
-      </w:r>
-    </w:p>
-    <w:p>
-      <w:pPr>
-        <w:tabs>
-          <w:tab w:val="left" w:pos="-1080"/>
-          <w:tab w:val="left" w:pos="-720"/>
-          <w:tab w:val="left" w:pos="0"/>
-          <w:tab w:val="left" w:pos="720"/>
-          <w:tab w:val="left" w:pos="1440"/>
-          <w:tab w:val="left" w:pos="2160"/>
-          <w:tab w:val="left" w:pos="2880"/>
-          <w:tab w:val="left" w:pos="3600"/>
-          <w:tab w:val="left" w:pos="4320"/>
-          <w:tab w:val="left" w:pos="4680"/>
-        </w:tabs>
-        <w:rPr>
-          <w:rFonts w:ascii="Palatino Linotype" w:hAnsi="Palatino Linotype"/>
-          <w:sz w:val="20"/>
-          <w:szCs w:val="20"/>
-        </w:rPr>
-      </w:pPr>
-      <w:r>
-        <w:rPr>
-          <w:rFonts w:ascii="Palatino Linotype" w:hAnsi="Palatino Linotype"/>
-          <w:sz w:val="20"/>
-          <w:szCs w:val="20"/>
-        </w:rPr>
         <w:t>{</w:t>
       </w:r>
       <w:r>
@@ -474,7 +74,27 @@
           <w:sz w:val="20"/>
           <w:szCs w:val="20"/>
         </w:rPr>
-        <w:t>% if judicial_officer</w:t>
+        <w:t xml:space="preserve">% if </w:t>
+      </w:r>
+      <w:proofErr w:type="spellStart"/>
+      <w:r>
+        <w:rPr>
+          <w:rFonts w:ascii="Palatino Linotype" w:hAnsi="Palatino Linotype"/>
+          <w:bCs/>
+          <w:sz w:val="20"/>
+          <w:szCs w:val="20"/>
+        </w:rPr>
+        <w:t>judicial_</w:t>
+      </w:r>
+      <w:proofErr w:type="gramStart"/>
+      <w:r>
+        <w:rPr>
+          <w:rFonts w:ascii="Palatino Linotype" w:hAnsi="Palatino Linotype"/>
+          <w:bCs/>
+          <w:sz w:val="20"/>
+          <w:szCs w:val="20"/>
+        </w:rPr>
+        <w:t>officer</w:t>
       </w:r>
       <w:r>
         <w:rPr>
@@ -485,6 +105,7 @@
         </w:rPr>
         <w:t>.officer</w:t>
       </w:r>
+      <w:proofErr w:type="gramEnd"/>
       <w:r>
         <w:rPr>
           <w:rFonts w:ascii="Palatino Linotype" w:hAnsi="Palatino Linotype"/>
@@ -494,6 +115,7 @@
         </w:rPr>
         <w:t>_type</w:t>
       </w:r>
+      <w:proofErr w:type="spellEnd"/>
       <w:r>
         <w:rPr>
           <w:rFonts w:ascii="Palatino Linotype" w:hAnsi="Palatino Linotype"/>
@@ -579,7 +201,61 @@
           <w:sz w:val="20"/>
           <w:szCs w:val="20"/>
         </w:rPr>
-        <w:t>{% elif judicial_officer.officer_type == ‘Judge’ %}</w:t>
+        <w:t xml:space="preserve">{% </w:t>
+      </w:r>
+      <w:proofErr w:type="spellStart"/>
+      <w:r>
+        <w:rPr>
+          <w:rFonts w:ascii="Palatino Linotype" w:hAnsi="Palatino Linotype"/>
+          <w:sz w:val="20"/>
+          <w:szCs w:val="20"/>
+        </w:rPr>
+        <w:t>elif</w:t>
+      </w:r>
+      <w:proofErr w:type="spellEnd"/>
+      <w:r>
+        <w:rPr>
+          <w:rFonts w:ascii="Palatino Linotype" w:hAnsi="Palatino Linotype"/>
+          <w:sz w:val="20"/>
+          <w:szCs w:val="20"/>
+        </w:rPr>
+        <w:t xml:space="preserve"> </w:t>
+      </w:r>
+      <w:proofErr w:type="spellStart"/>
+      <w:r>
+        <w:rPr>
+          <w:rFonts w:ascii="Palatino Linotype" w:hAnsi="Palatino Linotype"/>
+          <w:sz w:val="20"/>
+          <w:szCs w:val="20"/>
+        </w:rPr>
+        <w:t>judicial_</w:t>
+      </w:r>
+      <w:proofErr w:type="gramStart"/>
+      <w:r>
+        <w:rPr>
+          <w:rFonts w:ascii="Palatino Linotype" w:hAnsi="Palatino Linotype"/>
+          <w:sz w:val="20"/>
+          <w:szCs w:val="20"/>
+        </w:rPr>
+        <w:t>officer.officer</w:t>
+      </w:r>
+      <w:proofErr w:type="gramEnd"/>
+      <w:r>
+        <w:rPr>
+          <w:rFonts w:ascii="Palatino Linotype" w:hAnsi="Palatino Linotype"/>
+          <w:sz w:val="20"/>
+          <w:szCs w:val="20"/>
+        </w:rPr>
+        <w:t>_type</w:t>
+      </w:r>
+      <w:proofErr w:type="spellEnd"/>
+      <w:r>
+        <w:rPr>
+          <w:rFonts w:ascii="Palatino Linotype" w:hAnsi="Palatino Linotype"/>
+          <w:sz w:val="20"/>
+          <w:szCs w:val="20"/>
+        </w:rPr>
+        <w:t xml:space="preserve"> == ‘Judge’ %}</w:t>
       </w:r>
     </w:p>
     <w:p>
@@ -637,13 +313,41 @@
           <w:szCs w:val="20"/>
         </w:rPr>
       </w:pPr>
-      <w:r>
-        <w:rPr>
-          <w:rFonts w:ascii="Palatino Linotype" w:hAnsi="Palatino Linotype"/>
-          <w:sz w:val="20"/>
-          <w:szCs w:val="20"/>
-        </w:rPr>
-        <w:t>{{ court_costs_subdoc }}</w:t>
+      <w:proofErr w:type="gramStart"/>
+      <w:r>
+        <w:rPr>
+          <w:rFonts w:ascii="Palatino Linotype" w:hAnsi="Palatino Linotype"/>
+          <w:sz w:val="20"/>
+          <w:szCs w:val="20"/>
+        </w:rPr>
+        <w:t xml:space="preserve">{{ </w:t>
+      </w:r>
+      <w:proofErr w:type="spellStart"/>
+      <w:r>
+        <w:rPr>
+          <w:rFonts w:ascii="Palatino Linotype" w:hAnsi="Palatino Linotype"/>
+          <w:sz w:val="20"/>
+          <w:szCs w:val="20"/>
+        </w:rPr>
+        <w:t>charge</w:t>
+      </w:r>
+      <w:proofErr w:type="gramEnd"/>
+      <w:r>
+        <w:rPr>
+          <w:rFonts w:ascii="Palatino Linotype" w:hAnsi="Palatino Linotype"/>
+          <w:sz w:val="20"/>
+          <w:szCs w:val="20"/>
+        </w:rPr>
+        <w:t>_grid_subdoc</w:t>
+      </w:r>
+      <w:proofErr w:type="spellEnd"/>
+      <w:r>
+        <w:rPr>
+          <w:rFonts w:ascii="Palatino Linotype" w:hAnsi="Palatino Linotype"/>
+          <w:sz w:val="20"/>
+          <w:szCs w:val="20"/>
+        </w:rPr>
+        <w:t xml:space="preserve"> }}</w:t>
       </w:r>
     </w:p>
     <w:p>
@@ -656,6 +360,42 @@
           <w:szCs w:val="20"/>
         </w:rPr>
       </w:pPr>
+      <w:proofErr w:type="gramStart"/>
+      <w:r>
+        <w:rPr>
+          <w:rFonts w:ascii="Palatino Linotype" w:hAnsi="Palatino Linotype"/>
+          <w:sz w:val="20"/>
+          <w:szCs w:val="20"/>
+        </w:rPr>
+        <w:t xml:space="preserve">{{ </w:t>
+      </w:r>
+      <w:proofErr w:type="spellStart"/>
+      <w:r>
+        <w:rPr>
+          <w:rFonts w:ascii="Palatino Linotype" w:hAnsi="Palatino Linotype"/>
+          <w:sz w:val="20"/>
+          <w:szCs w:val="20"/>
+        </w:rPr>
+        <w:t>court</w:t>
+      </w:r>
+      <w:proofErr w:type="gramEnd"/>
+      <w:r>
+        <w:rPr>
+          <w:rFonts w:ascii="Palatino Linotype" w:hAnsi="Palatino Linotype"/>
+          <w:sz w:val="20"/>
+          <w:szCs w:val="20"/>
+        </w:rPr>
+        <w:t>_costs_subdoc</w:t>
+      </w:r>
+      <w:proofErr w:type="spellEnd"/>
+      <w:r>
+        <w:rPr>
+          <w:rFonts w:ascii="Palatino Linotype" w:hAnsi="Palatino Linotype"/>
+          <w:sz w:val="20"/>
+          <w:szCs w:val="20"/>
+        </w:rPr>
+        <w:t xml:space="preserve"> }}</w:t>
+      </w:r>
     </w:p>
     <w:p>
       <w:pPr>
@@ -776,21 +516,49 @@
         </w:rPr>
         <w:tab/>
       </w:r>
-      <w:r>
-        <w:rPr>
-          <w:rFonts w:ascii="Palatino Linotype" w:hAnsi="Palatino Linotype"/>
-          <w:sz w:val="20"/>
-          <w:szCs w:val="20"/>
-        </w:rPr>
-        <w:t>{{ judicial_officer.officer_</w:t>
-      </w:r>
-      <w:r>
-        <w:rPr>
-          <w:rFonts w:ascii="Palatino Linotype" w:hAnsi="Palatino Linotype"/>
-          <w:sz w:val="20"/>
-          <w:szCs w:val="20"/>
-        </w:rPr>
-        <w:t>type }}</w:t>
+      <w:proofErr w:type="gramStart"/>
+      <w:r>
+        <w:rPr>
+          <w:rFonts w:ascii="Palatino Linotype" w:hAnsi="Palatino Linotype"/>
+          <w:sz w:val="20"/>
+          <w:szCs w:val="20"/>
+        </w:rPr>
+        <w:t xml:space="preserve">{{ </w:t>
+      </w:r>
+      <w:proofErr w:type="spellStart"/>
+      <w:r>
+        <w:rPr>
+          <w:rFonts w:ascii="Palatino Linotype" w:hAnsi="Palatino Linotype"/>
+          <w:sz w:val="20"/>
+          <w:szCs w:val="20"/>
+        </w:rPr>
+        <w:t>judicial</w:t>
+      </w:r>
+      <w:proofErr w:type="gramEnd"/>
+      <w:r>
+        <w:rPr>
+          <w:rFonts w:ascii="Palatino Linotype" w:hAnsi="Palatino Linotype"/>
+          <w:sz w:val="20"/>
+          <w:szCs w:val="20"/>
+        </w:rPr>
+        <w:t>_officer.officer_</w:t>
+      </w:r>
+      <w:r>
+        <w:rPr>
+          <w:rFonts w:ascii="Palatino Linotype" w:hAnsi="Palatino Linotype"/>
+          <w:sz w:val="20"/>
+          <w:szCs w:val="20"/>
+        </w:rPr>
+        <w:t>type</w:t>
+      </w:r>
+      <w:proofErr w:type="spellEnd"/>
+      <w:r>
+        <w:rPr>
+          <w:rFonts w:ascii="Palatino Linotype" w:hAnsi="Palatino Linotype"/>
+          <w:sz w:val="20"/>
+          <w:szCs w:val="20"/>
+        </w:rPr>
+        <w:t xml:space="preserve"> }}</w:t>
       </w:r>
       <w:r>
         <w:rPr>
@@ -806,7 +574,16 @@
           <w:sz w:val="20"/>
           <w:szCs w:val="20"/>
         </w:rPr>
-        <w:t>{{ judicial_officer</w:t>
+        <w:t xml:space="preserve">{{ </w:t>
+      </w:r>
+      <w:proofErr w:type="spellStart"/>
+      <w:r>
+        <w:rPr>
+          <w:rFonts w:ascii="Palatino Linotype" w:hAnsi="Palatino Linotype"/>
+          <w:sz w:val="20"/>
+          <w:szCs w:val="20"/>
+        </w:rPr>
+        <w:t>judicial_officer</w:t>
       </w:r>
       <w:r>
         <w:rPr>
@@ -816,6 +593,7 @@
         </w:rPr>
         <w:t>.first_name</w:t>
       </w:r>
+      <w:proofErr w:type="spellEnd"/>
       <w:r>
         <w:rPr>
           <w:rFonts w:ascii="Palatino Linotype" w:hAnsi="Palatino Linotype"/>
@@ -838,7 +616,16 @@
           <w:sz w:val="20"/>
           <w:szCs w:val="20"/>
         </w:rPr>
-        <w:t>{{ judicial_officer</w:t>
+        <w:t xml:space="preserve">{{ </w:t>
+      </w:r>
+      <w:proofErr w:type="spellStart"/>
+      <w:r>
+        <w:rPr>
+          <w:rFonts w:ascii="Palatino Linotype" w:hAnsi="Palatino Linotype"/>
+          <w:sz w:val="20"/>
+          <w:szCs w:val="20"/>
+        </w:rPr>
+        <w:t>judicial_officer</w:t>
       </w:r>
       <w:r>
         <w:rPr>
@@ -848,6 +635,7 @@
         </w:rPr>
         <w:t>.last_name</w:t>
       </w:r>
+      <w:proofErr w:type="spellEnd"/>
       <w:r>
         <w:rPr>
           <w:rFonts w:ascii="Palatino Linotype" w:hAnsi="Palatino Linotype"/>
@@ -893,16 +681,56 @@
           <w:sz w:val="20"/>
           <w:szCs w:val="20"/>
         </w:rPr>
-        <w:t>% if judicial_of</w:t>
-      </w:r>
-      <w:r>
-        <w:rPr>
-          <w:rFonts w:ascii="Palatino Linotype" w:hAnsi="Palatino Linotype"/>
-          <w:bCs/>
-          <w:sz w:val="20"/>
-          <w:szCs w:val="20"/>
-        </w:rPr>
-        <w:t>ficer.officer_type  ==  ‘Magistrate’ %}</w:t>
+        <w:t xml:space="preserve">% if </w:t>
+      </w:r>
+      <w:proofErr w:type="spellStart"/>
+      <w:r>
+        <w:rPr>
+          <w:rFonts w:ascii="Palatino Linotype" w:hAnsi="Palatino Linotype"/>
+          <w:bCs/>
+          <w:sz w:val="20"/>
+          <w:szCs w:val="20"/>
+        </w:rPr>
+        <w:t>judicial_</w:t>
+      </w:r>
+      <w:proofErr w:type="gramStart"/>
+      <w:r>
+        <w:rPr>
+          <w:rFonts w:ascii="Palatino Linotype" w:hAnsi="Palatino Linotype"/>
+          <w:bCs/>
+          <w:sz w:val="20"/>
+          <w:szCs w:val="20"/>
+        </w:rPr>
+        <w:t>of</w:t>
+      </w:r>
+      <w:r>
+        <w:rPr>
+          <w:rFonts w:ascii="Palatino Linotype" w:hAnsi="Palatino Linotype"/>
+          <w:bCs/>
+          <w:sz w:val="20"/>
+          <w:szCs w:val="20"/>
+        </w:rPr>
+        <w:t>ficer.officer</w:t>
+      </w:r>
+      <w:proofErr w:type="gramEnd"/>
+      <w:r>
+        <w:rPr>
+          <w:rFonts w:ascii="Palatino Linotype" w:hAnsi="Palatino Linotype"/>
+          <w:bCs/>
+          <w:sz w:val="20"/>
+          <w:szCs w:val="20"/>
+        </w:rPr>
+        <w:t>_type</w:t>
+      </w:r>
+      <w:proofErr w:type="spellEnd"/>
+      <w:r>
+        <w:rPr>
+          <w:rFonts w:ascii="Palatino Linotype" w:hAnsi="Palatino Linotype"/>
+          <w:bCs/>
+          <w:sz w:val="20"/>
+          <w:szCs w:val="20"/>
+        </w:rPr>
+        <w:t xml:space="preserve">  ==  ‘Magistrate’ %}</w:t>
       </w:r>
     </w:p>
     <w:p>
@@ -1002,6 +830,7 @@
           <w:szCs w:val="16"/>
         </w:rPr>
       </w:pPr>
+      <w:proofErr w:type="gramStart"/>
       <w:r>
         <w:rPr>
           <w:rFonts w:ascii="Palatino Linotype" w:hAnsi="Palatino Linotype"/>
@@ -1016,16 +845,43 @@
           <w:sz w:val="16"/>
           <w:szCs w:val="16"/>
         </w:rPr>
-        <w:t xml:space="preserve"> service_subdoc }}</w:t>
+        <w:t xml:space="preserve"> </w:t>
+      </w:r>
+      <w:proofErr w:type="spellStart"/>
+      <w:r>
+        <w:rPr>
+          <w:rFonts w:ascii="Palatino Linotype" w:hAnsi="Palatino Linotype"/>
+          <w:sz w:val="16"/>
+          <w:szCs w:val="16"/>
+        </w:rPr>
+        <w:t>service</w:t>
+      </w:r>
+      <w:proofErr w:type="gramEnd"/>
+      <w:r>
+        <w:rPr>
+          <w:rFonts w:ascii="Palatino Linotype" w:hAnsi="Palatino Linotype"/>
+          <w:sz w:val="16"/>
+          <w:szCs w:val="16"/>
+        </w:rPr>
+        <w:t>_subdoc</w:t>
+      </w:r>
+      <w:proofErr w:type="spellEnd"/>
+      <w:r>
+        <w:rPr>
+          <w:rFonts w:ascii="Palatino Linotype" w:hAnsi="Palatino Linotype"/>
+          <w:sz w:val="16"/>
+          <w:szCs w:val="16"/>
+        </w:rPr>
+        <w:t xml:space="preserve"> }}</w:t>
       </w:r>
     </w:p>
     <w:sectPr>
-      <w:headerReference w:type="even" r:id="rId4"/>
-      <w:headerReference w:type="default" r:id="rId5"/>
-      <w:footerReference w:type="even" r:id="rId6"/>
-      <w:footerReference w:type="default" r:id="rId7"/>
-      <w:headerReference w:type="first" r:id="rId8"/>
-      <w:footerReference w:type="first" r:id="rId9"/>
+      <w:headerReference w:type="even" r:id="rId6"/>
+      <w:headerReference w:type="default" r:id="rId7"/>
+      <w:footerReference w:type="even" r:id="rId8"/>
+      <w:footerReference w:type="default" r:id="rId9"/>
+      <w:headerReference w:type="first" r:id="rId10"/>
+      <w:footerReference w:type="first" r:id="rId11"/>
       <w:pgSz w:w="12240" w:h="15840"/>
       <w:pgMar w:top="1440" w:right="1080" w:bottom="1440" w:left="1080" w:header="720" w:footer="720" w:gutter="0"/>
       <w:cols w:space="720"/>
@@ -1034,6 +890,25 @@
     </w:sectPr>
   </w:body>
 </w:document>
+</file>
+
+<file path=word/endnotes.xml><?xml version="1.0" encoding="utf-8"?>
+<w:endnotes xmlns:wpc="http://schemas.microsoft.com/office/word/2010/wordprocessingCanvas" xmlns:cx="http://schemas.microsoft.com/office/drawing/2014/chartex" xmlns:cx1="http://schemas.microsoft.com/office/drawing/2015/9/8/chartex" xmlns:cx2="http://schemas.microsoft.com/office/drawing/2015/10/21/chartex" xmlns:cx3="http://schemas.microsoft.com/office/drawing/2016/5/9/chartex" xmlns:cx4="http://schemas.microsoft.com/office/drawing/2016/5/10/chartex" xmlns:cx5="http://schemas.microsoft.com/office/drawing/2016/5/11/chartex" xmlns:cx6="http://schemas.microsoft.com/office/drawing/2016/5/12/chartex" xmlns:cx7="http://schemas.microsoft.com/office/drawing/2016/5/13/chartex" xmlns:cx8="http://schemas.microsoft.com/office/drawing/2016/5/14/chartex" xmlns:mc="http://schemas.openxmlformats.org/markup-compatibility/2006" xmlns:aink="http://schemas.microsoft.com/office/drawing/2016/ink" xmlns:am3d="http://schemas.microsoft.com/office/drawing/2017/model3d" xmlns:o="urn:schemas-microsoft-com:office:office" xmlns:oel="http://schemas.microsoft.com/office/2019/extlst" xmlns:r="http://schemas.openxmlformats.org/officeDocument/2006/relationships" xmlns:m="http://schemas.openxmlformats.org/officeDocument/2006/math" xmlns:v="urn:schemas-microsoft-com:vml" xmlns:wp14="http://schemas.microsoft.com/office/word/2010/wordprocessingDrawing" xmlns:wp="http://schemas.openxmlformats.org/drawingml/2006/wordprocessingDrawing" xmlns:w10="urn:schemas-microsoft-com:office:word" xmlns:w="http://schemas.openxmlformats.org/wordprocessingml/2006/main" xmlns:w14="http://schemas.microsoft.com/office/word/2010/wordml" xmlns:w15="http://schemas.microsoft.com/office/word/2012/wordml" xmlns:w16cex="http://schemas.microsoft.com/office/word/2018/wordml/cex" xmlns:w16cid="http://schemas.microsoft.com/office/word/2016/wordml/cid" xmlns:w16="http://schemas.microsoft.com/office/word/2018/wordml" xmlns:w16sdtdh="http://schemas.microsoft.com/office/word/2020/wordml/sdtdatahash" xmlns:w16se="http://schemas.microsoft.com/office/word/2015/wordml/symex" xmlns:wpg="http://schemas.microsoft.com/office/word/2010/wordprocessingGroup" xmlns:wpi="http://schemas.microsoft.com/office/word/2010/wordprocessingInk" xmlns:wne="http://schemas.microsoft.com/office/word/2006/wordml" xmlns:wps="http://schemas.microsoft.com/office/word/2010/wordprocessingShape" mc:Ignorable="w14 w15 w16se w16cid w16 w16cex w16sdtdh wp14">
+  <w:endnote w:type="separator" w:id="-1">
+    <w:p>
+      <w:r>
+        <w:separator/>
+      </w:r>
+    </w:p>
+  </w:endnote>
+  <w:endnote w:type="continuationSeparator" w:id="0">
+    <w:p>
+      <w:r>
+        <w:continuationSeparator/>
+      </w:r>
+    </w:p>
+  </w:endnote>
+</w:endnotes>
 </file>
 
 <file path=word/footer1.xml><?xml version="1.0" encoding="utf-8"?>
@@ -1243,23 +1118,109 @@
                 <w:sz w:val="20"/>
                 <w:szCs w:val="20"/>
               </w:rPr>
-              <w:t>% if judicial_officer.officer_type  ==  ‘Magistrate’ %}Magistrate Decision</w:t>
-            </w:r>
-            <w:r>
-              <w:rPr>
-                <w:rFonts w:ascii="Palatino Linotype" w:hAnsi="Palatino Linotype"/>
-                <w:sz w:val="20"/>
-                <w:szCs w:val="20"/>
-              </w:rPr>
-              <w:t>{% elif judicial_officer.officer_t</w:t>
-            </w:r>
-            <w:r>
-              <w:rPr>
-                <w:rFonts w:ascii="Palatino Linotype" w:hAnsi="Palatino Linotype"/>
-                <w:sz w:val="20"/>
-                <w:szCs w:val="20"/>
-              </w:rPr>
-              <w:t>ype == ‘Judge’ %}Final Judgment Entry{% endif %} {{ case_number }}</w:t>
+              <w:t xml:space="preserve">% if </w:t>
+            </w:r>
+            <w:proofErr w:type="spellStart"/>
+            <w:r>
+              <w:rPr>
+                <w:rFonts w:ascii="Palatino Linotype" w:hAnsi="Palatino Linotype"/>
+                <w:bCs/>
+                <w:sz w:val="20"/>
+                <w:szCs w:val="20"/>
+              </w:rPr>
+              <w:t>judicial_</w:t>
+            </w:r>
+            <w:proofErr w:type="gramStart"/>
+            <w:r>
+              <w:rPr>
+                <w:rFonts w:ascii="Palatino Linotype" w:hAnsi="Palatino Linotype"/>
+                <w:bCs/>
+                <w:sz w:val="20"/>
+                <w:szCs w:val="20"/>
+              </w:rPr>
+              <w:t>officer.officer</w:t>
+            </w:r>
+            <w:proofErr w:type="gramEnd"/>
+            <w:r>
+              <w:rPr>
+                <w:rFonts w:ascii="Palatino Linotype" w:hAnsi="Palatino Linotype"/>
+                <w:bCs/>
+                <w:sz w:val="20"/>
+                <w:szCs w:val="20"/>
+              </w:rPr>
+              <w:t>_type</w:t>
+            </w:r>
+            <w:proofErr w:type="spellEnd"/>
+            <w:r>
+              <w:rPr>
+                <w:rFonts w:ascii="Palatino Linotype" w:hAnsi="Palatino Linotype"/>
+                <w:bCs/>
+                <w:sz w:val="20"/>
+                <w:szCs w:val="20"/>
+              </w:rPr>
+              <w:t xml:space="preserve">  ==  ‘Magistrate’ %}Magistrate Decision</w:t>
+            </w:r>
+            <w:r>
+              <w:rPr>
+                <w:rFonts w:ascii="Palatino Linotype" w:hAnsi="Palatino Linotype"/>
+                <w:sz w:val="20"/>
+                <w:szCs w:val="20"/>
+              </w:rPr>
+              <w:t xml:space="preserve">{% </w:t>
+            </w:r>
+            <w:proofErr w:type="spellStart"/>
+            <w:r>
+              <w:rPr>
+                <w:rFonts w:ascii="Palatino Linotype" w:hAnsi="Palatino Linotype"/>
+                <w:sz w:val="20"/>
+                <w:szCs w:val="20"/>
+              </w:rPr>
+              <w:t>elif</w:t>
+            </w:r>
+            <w:proofErr w:type="spellEnd"/>
+            <w:r>
+              <w:rPr>
+                <w:rFonts w:ascii="Palatino Linotype" w:hAnsi="Palatino Linotype"/>
+                <w:sz w:val="20"/>
+                <w:szCs w:val="20"/>
+              </w:rPr>
+              <w:t xml:space="preserve"> </w:t>
+            </w:r>
+            <w:proofErr w:type="spellStart"/>
+            <w:r>
+              <w:rPr>
+                <w:rFonts w:ascii="Palatino Linotype" w:hAnsi="Palatino Linotype"/>
+                <w:sz w:val="20"/>
+                <w:szCs w:val="20"/>
+              </w:rPr>
+              <w:t>judicial_officer.officer_type</w:t>
+            </w:r>
+            <w:proofErr w:type="spellEnd"/>
+            <w:r>
+              <w:rPr>
+                <w:rFonts w:ascii="Palatino Linotype" w:hAnsi="Palatino Linotype"/>
+                <w:sz w:val="20"/>
+                <w:szCs w:val="20"/>
+              </w:rPr>
+              <w:t xml:space="preserve"> == ‘Judge’ %}Final Judgment Entry{% endif %} {{ </w:t>
+            </w:r>
+            <w:proofErr w:type="spellStart"/>
+            <w:r>
+              <w:rPr>
+                <w:rFonts w:ascii="Palatino Linotype" w:hAnsi="Palatino Linotype"/>
+                <w:sz w:val="20"/>
+                <w:szCs w:val="20"/>
+              </w:rPr>
+              <w:t>case_number</w:t>
+            </w:r>
+            <w:proofErr w:type="spellEnd"/>
+            <w:r>
+              <w:rPr>
+                <w:rFonts w:ascii="Palatino Linotype" w:hAnsi="Palatino Linotype"/>
+                <w:sz w:val="20"/>
+                <w:szCs w:val="20"/>
+              </w:rPr>
+              <w:t xml:space="preserve"> }}</w:t>
             </w:r>
           </w:p>
           <w:p>
@@ -1305,6 +1266,25 @@
     </w:pPr>
   </w:p>
 </w:ftr>
+</file>
+
+<file path=word/footnotes.xml><?xml version="1.0" encoding="utf-8"?>
+<w:footnotes xmlns:wpc="http://schemas.microsoft.com/office/word/2010/wordprocessingCanvas" xmlns:cx="http://schemas.microsoft.com/office/drawing/2014/chartex" xmlns:cx1="http://schemas.microsoft.com/office/drawing/2015/9/8/chartex" xmlns:cx2="http://schemas.microsoft.com/office/drawing/2015/10/21/chartex" xmlns:cx3="http://schemas.microsoft.com/office/drawing/2016/5/9/chartex" xmlns:cx4="http://schemas.microsoft.com/office/drawing/2016/5/10/chartex" xmlns:cx5="http://schemas.microsoft.com/office/drawing/2016/5/11/chartex" xmlns:cx6="http://schemas.microsoft.com/office/drawing/2016/5/12/chartex" xmlns:cx7="http://schemas.microsoft.com/office/drawing/2016/5/13/chartex" xmlns:cx8="http://schemas.microsoft.com/office/drawing/2016/5/14/chartex" xmlns:mc="http://schemas.openxmlformats.org/markup-compatibility/2006" xmlns:aink="http://schemas.microsoft.com/office/drawing/2016/ink" xmlns:am3d="http://schemas.microsoft.com/office/drawing/2017/model3d" xmlns:o="urn:schemas-microsoft-com:office:office" xmlns:oel="http://schemas.microsoft.com/office/2019/extlst" xmlns:r="http://schemas.openxmlformats.org/officeDocument/2006/relationships" xmlns:m="http://schemas.openxmlformats.org/officeDocument/2006/math" xmlns:v="urn:schemas-microsoft-com:vml" xmlns:wp14="http://schemas.microsoft.com/office/word/2010/wordprocessingDrawing" xmlns:wp="http://schemas.openxmlformats.org/drawingml/2006/wordprocessingDrawing" xmlns:w10="urn:schemas-microsoft-com:office:word" xmlns:w="http://schemas.openxmlformats.org/wordprocessingml/2006/main" xmlns:w14="http://schemas.microsoft.com/office/word/2010/wordml" xmlns:w15="http://schemas.microsoft.com/office/word/2012/wordml" xmlns:w16cex="http://schemas.microsoft.com/office/word/2018/wordml/cex" xmlns:w16cid="http://schemas.microsoft.com/office/word/2016/wordml/cid" xmlns:w16="http://schemas.microsoft.com/office/word/2018/wordml" xmlns:w16sdtdh="http://schemas.microsoft.com/office/word/2020/wordml/sdtdatahash" xmlns:w16se="http://schemas.microsoft.com/office/word/2015/wordml/symex" xmlns:wpg="http://schemas.microsoft.com/office/word/2010/wordprocessingGroup" xmlns:wpi="http://schemas.microsoft.com/office/word/2010/wordprocessingInk" xmlns:wne="http://schemas.microsoft.com/office/word/2006/wordml" xmlns:wps="http://schemas.microsoft.com/office/word/2010/wordprocessingShape" mc:Ignorable="w14 w15 w16se w16cid w16 w16cex w16sdtdh wp14">
+  <w:footnote w:type="separator" w:id="-1">
+    <w:p>
+      <w:r>
+        <w:separator/>
+      </w:r>
+    </w:p>
+  </w:footnote>
+  <w:footnote w:type="continuationSeparator" w:id="0">
+    <w:p>
+      <w:r>
+        <w:continuationSeparator/>
+      </w:r>
+    </w:p>
+  </w:footnote>
+</w:footnotes>
 </file>
 
 <file path=word/header1.xml><?xml version="1.0" encoding="utf-8"?>

</xml_diff>

<commit_message>
Breaking down templates more.
</commit_message>
<xml_diff>
--- a/resources/Templates/Base_Template.docx
+++ b/resources/Templates/Base_Template.docx
@@ -25,7 +25,6 @@
           <w:szCs w:val="20"/>
         </w:rPr>
       </w:pPr>
-      <w:proofErr w:type="gramStart"/>
       <w:r>
         <w:rPr>
           <w:rFonts w:ascii="Palatino Linotype" w:hAnsi="Palatino Linotype"/>
@@ -40,34 +39,7 @@
           <w:sz w:val="20"/>
           <w:szCs w:val="20"/>
         </w:rPr>
-        <w:t xml:space="preserve">{ </w:t>
-      </w:r>
-      <w:proofErr w:type="spellStart"/>
-      <w:r>
-        <w:rPr>
-          <w:rFonts w:ascii="Palatino Linotype" w:hAnsi="Palatino Linotype"/>
-          <w:sz w:val="20"/>
-          <w:szCs w:val="20"/>
-        </w:rPr>
-        <w:t>caption</w:t>
-      </w:r>
-      <w:proofErr w:type="gramEnd"/>
-      <w:r>
-        <w:rPr>
-          <w:rFonts w:ascii="Palatino Linotype" w:hAnsi="Palatino Linotype"/>
-          <w:sz w:val="20"/>
-          <w:szCs w:val="20"/>
-        </w:rPr>
-        <w:t>_subdoc</w:t>
-      </w:r>
-      <w:proofErr w:type="spellEnd"/>
-      <w:r>
-        <w:rPr>
-          <w:rFonts w:ascii="Palatino Linotype" w:hAnsi="Palatino Linotype"/>
-          <w:sz w:val="20"/>
-          <w:szCs w:val="20"/>
-        </w:rPr>
-        <w:t xml:space="preserve"> }}</w:t>
+        <w:t>{ caption_subdoc }}</w:t>
       </w:r>
     </w:p>
     <w:p>
@@ -94,219 +66,18 @@
           <w:szCs w:val="20"/>
         </w:rPr>
       </w:pPr>
-      <w:proofErr w:type="gramStart"/>
       <w:r>
         <w:rPr>
           <w:rFonts w:ascii="Palatino Linotype" w:hAnsi="Palatino Linotype"/>
           <w:sz w:val="20"/>
           <w:szCs w:val="20"/>
         </w:rPr>
-        <w:t xml:space="preserve">{{ </w:t>
-      </w:r>
-      <w:proofErr w:type="spellStart"/>
-      <w:r>
-        <w:rPr>
-          <w:rFonts w:ascii="Palatino Linotype" w:hAnsi="Palatino Linotype"/>
-          <w:sz w:val="20"/>
-          <w:szCs w:val="20"/>
-        </w:rPr>
-        <w:t>document</w:t>
-      </w:r>
-      <w:proofErr w:type="gramEnd"/>
-      <w:r>
-        <w:rPr>
-          <w:rFonts w:ascii="Palatino Linotype" w:hAnsi="Palatino Linotype"/>
-          <w:sz w:val="20"/>
-          <w:szCs w:val="20"/>
-        </w:rPr>
-        <w:t>_title_subdoc</w:t>
-      </w:r>
-      <w:proofErr w:type="spellEnd"/>
-      <w:r>
-        <w:rPr>
-          <w:rFonts w:ascii="Palatino Linotype" w:hAnsi="Palatino Linotype"/>
-          <w:sz w:val="20"/>
-          <w:szCs w:val="20"/>
-        </w:rPr>
-        <w:t xml:space="preserve"> }}</w:t>
+        <w:t>{{ document_title_subdoc }}</w:t>
       </w:r>
     </w:p>
     <w:p>
       <w:pPr>
-        <w:tabs>
-          <w:tab w:val="center" w:pos="4680"/>
-        </w:tabs>
-        <w:contextualSpacing/>
-        <w:rPr>
-          <w:rFonts w:ascii="Palatino Linotype" w:hAnsi="Palatino Linotype"/>
-          <w:sz w:val="20"/>
-          <w:szCs w:val="20"/>
-        </w:rPr>
-      </w:pPr>
-      <w:proofErr w:type="gramStart"/>
-      <w:r>
-        <w:rPr>
-          <w:rFonts w:ascii="Palatino Linotype" w:hAnsi="Palatino Linotype"/>
-          <w:sz w:val="20"/>
-          <w:szCs w:val="20"/>
-        </w:rPr>
-        <w:t xml:space="preserve">{{ </w:t>
-      </w:r>
-      <w:proofErr w:type="spellStart"/>
-      <w:r>
-        <w:rPr>
-          <w:rFonts w:ascii="Palatino Linotype" w:hAnsi="Palatino Linotype"/>
-          <w:sz w:val="20"/>
-          <w:szCs w:val="20"/>
-        </w:rPr>
-        <w:t>charge</w:t>
-      </w:r>
-      <w:proofErr w:type="gramEnd"/>
-      <w:r>
-        <w:rPr>
-          <w:rFonts w:ascii="Palatino Linotype" w:hAnsi="Palatino Linotype"/>
-          <w:sz w:val="20"/>
-          <w:szCs w:val="20"/>
-        </w:rPr>
-        <w:t>_grid_subdoc</w:t>
-      </w:r>
-      <w:proofErr w:type="spellEnd"/>
-      <w:r>
-        <w:rPr>
-          <w:rFonts w:ascii="Palatino Linotype" w:hAnsi="Palatino Linotype"/>
-          <w:sz w:val="20"/>
-          <w:szCs w:val="20"/>
-        </w:rPr>
-        <w:t xml:space="preserve"> }}</w:t>
-      </w:r>
-    </w:p>
-    <w:p>
-      <w:pPr>
-        <w:spacing w:line="276" w:lineRule="auto"/>
-        <w:contextualSpacing/>
-        <w:jc w:val="both"/>
-        <w:rPr>
-          <w:rFonts w:ascii="Palatino Linotype" w:hAnsi="Palatino Linotype"/>
-          <w:sz w:val="20"/>
-          <w:szCs w:val="20"/>
-        </w:rPr>
-      </w:pPr>
-      <w:proofErr w:type="gramStart"/>
-      <w:r>
-        <w:rPr>
-          <w:rFonts w:ascii="Palatino Linotype" w:hAnsi="Palatino Linotype"/>
-          <w:sz w:val="20"/>
-          <w:szCs w:val="20"/>
-        </w:rPr>
-        <w:t xml:space="preserve">{{ </w:t>
-      </w:r>
-      <w:proofErr w:type="spellStart"/>
-      <w:r>
-        <w:rPr>
-          <w:rFonts w:ascii="Palatino Linotype" w:hAnsi="Palatino Linotype"/>
-          <w:sz w:val="20"/>
-          <w:szCs w:val="20"/>
-        </w:rPr>
-        <w:t>court</w:t>
-      </w:r>
-      <w:proofErr w:type="gramEnd"/>
-      <w:r>
-        <w:rPr>
-          <w:rFonts w:ascii="Palatino Linotype" w:hAnsi="Palatino Linotype"/>
-          <w:sz w:val="20"/>
-          <w:szCs w:val="20"/>
-        </w:rPr>
-        <w:t>_costs_subdoc</w:t>
-      </w:r>
-      <w:proofErr w:type="spellEnd"/>
-      <w:r>
-        <w:rPr>
-          <w:rFonts w:ascii="Palatino Linotype" w:hAnsi="Palatino Linotype"/>
-          <w:sz w:val="20"/>
-          <w:szCs w:val="20"/>
-        </w:rPr>
-        <w:t xml:space="preserve"> }}</w:t>
-      </w:r>
-    </w:p>
-    <w:p>
-      <w:pPr>
-        <w:spacing w:line="276" w:lineRule="auto"/>
-        <w:contextualSpacing/>
-        <w:jc w:val="both"/>
-        <w:rPr>
-          <w:rFonts w:ascii="Palatino Linotype" w:hAnsi="Palatino Linotype"/>
-          <w:sz w:val="20"/>
-          <w:szCs w:val="20"/>
-        </w:rPr>
-      </w:pPr>
-      <w:r>
-        <w:rPr>
-          <w:rFonts w:ascii="Palatino Linotype" w:hAnsi="Palatino Linotype"/>
-          <w:sz w:val="20"/>
-          <w:szCs w:val="20"/>
-        </w:rPr>
-        <w:tab/>
-      </w:r>
-      <w:r>
-        <w:rPr>
-          <w:rFonts w:ascii="Palatino Linotype" w:hAnsi="Palatino Linotype"/>
-          <w:sz w:val="20"/>
-          <w:szCs w:val="20"/>
-        </w:rPr>
-        <w:tab/>
-      </w:r>
-      <w:r>
-        <w:rPr>
-          <w:rFonts w:ascii="Palatino Linotype" w:hAnsi="Palatino Linotype"/>
-          <w:sz w:val="20"/>
-          <w:szCs w:val="20"/>
-        </w:rPr>
-        <w:tab/>
-      </w:r>
-      <w:r>
-        <w:rPr>
-          <w:rFonts w:ascii="Palatino Linotype" w:hAnsi="Palatino Linotype"/>
-          <w:sz w:val="20"/>
-          <w:szCs w:val="20"/>
-        </w:rPr>
-        <w:tab/>
-      </w:r>
-      <w:r>
-        <w:rPr>
-          <w:rFonts w:ascii="Palatino Linotype" w:hAnsi="Palatino Linotype"/>
-          <w:sz w:val="20"/>
-          <w:szCs w:val="20"/>
-        </w:rPr>
-        <w:tab/>
-      </w:r>
-      <w:r>
-        <w:rPr>
-          <w:rFonts w:ascii="Palatino Linotype" w:hAnsi="Palatino Linotype"/>
-          <w:sz w:val="20"/>
-          <w:szCs w:val="20"/>
-        </w:rPr>
-        <w:tab/>
-      </w:r>
-      <w:r>
-        <w:rPr>
-          <w:rFonts w:ascii="Palatino Linotype" w:hAnsi="Palatino Linotype"/>
-          <w:sz w:val="20"/>
-          <w:szCs w:val="20"/>
-        </w:rPr>
-        <w:tab/>
-      </w:r>
-      <w:r>
-        <w:rPr>
-          <w:rFonts w:ascii="Palatino Linotype" w:hAnsi="Palatino Linotype"/>
-          <w:sz w:val="20"/>
-          <w:szCs w:val="20"/>
-        </w:rPr>
-        <w:tab/>
-        <w:t>____________________________________</w:t>
-      </w:r>
-    </w:p>
-    <w:p>
-      <w:pPr>
+        <w:keepNext/>
         <w:tabs>
           <w:tab w:val="left" w:pos="-1080"/>
           <w:tab w:val="left" w:pos="-720"/>
@@ -319,7 +90,7 @@
           <w:tab w:val="left" w:pos="4320"/>
           <w:tab w:val="left" w:pos="4680"/>
         </w:tabs>
-        <w:ind w:firstLine="4680"/>
+        <w:ind w:left="4680" w:hanging="4680"/>
         <w:contextualSpacing/>
         <w:jc w:val="both"/>
         <w:rPr>
@@ -334,224 +105,7 @@
           <w:sz w:val="20"/>
           <w:szCs w:val="20"/>
         </w:rPr>
-        <w:tab/>
-      </w:r>
-      <w:proofErr w:type="gramStart"/>
-      <w:r>
-        <w:rPr>
-          <w:rFonts w:ascii="Palatino Linotype" w:hAnsi="Palatino Linotype"/>
-          <w:sz w:val="20"/>
-          <w:szCs w:val="20"/>
-        </w:rPr>
-        <w:t xml:space="preserve">{{ </w:t>
-      </w:r>
-      <w:proofErr w:type="spellStart"/>
-      <w:r>
-        <w:rPr>
-          <w:rFonts w:ascii="Palatino Linotype" w:hAnsi="Palatino Linotype"/>
-          <w:sz w:val="20"/>
-          <w:szCs w:val="20"/>
-        </w:rPr>
-        <w:t>judicial</w:t>
-      </w:r>
-      <w:proofErr w:type="gramEnd"/>
-      <w:r>
-        <w:rPr>
-          <w:rFonts w:ascii="Palatino Linotype" w:hAnsi="Palatino Linotype"/>
-          <w:sz w:val="20"/>
-          <w:szCs w:val="20"/>
-        </w:rPr>
-        <w:t>_officer.officer_</w:t>
-      </w:r>
-      <w:r>
-        <w:rPr>
-          <w:rFonts w:ascii="Palatino Linotype" w:hAnsi="Palatino Linotype"/>
-          <w:sz w:val="20"/>
-          <w:szCs w:val="20"/>
-        </w:rPr>
-        <w:t>type</w:t>
-      </w:r>
-      <w:proofErr w:type="spellEnd"/>
-      <w:r>
-        <w:rPr>
-          <w:rFonts w:ascii="Palatino Linotype" w:hAnsi="Palatino Linotype"/>
-          <w:sz w:val="20"/>
-          <w:szCs w:val="20"/>
-        </w:rPr>
-        <w:t xml:space="preserve"> }}</w:t>
-      </w:r>
-      <w:r>
-        <w:rPr>
-          <w:rFonts w:ascii="Palatino Linotype" w:hAnsi="Palatino Linotype"/>
-          <w:sz w:val="20"/>
-          <w:szCs w:val="20"/>
-        </w:rPr>
-        <w:t xml:space="preserve"> </w:t>
-      </w:r>
-      <w:r>
-        <w:rPr>
-          <w:rFonts w:ascii="Palatino Linotype" w:hAnsi="Palatino Linotype"/>
-          <w:sz w:val="20"/>
-          <w:szCs w:val="20"/>
-        </w:rPr>
-        <w:t xml:space="preserve">{{ </w:t>
-      </w:r>
-      <w:proofErr w:type="spellStart"/>
-      <w:r>
-        <w:rPr>
-          <w:rFonts w:ascii="Palatino Linotype" w:hAnsi="Palatino Linotype"/>
-          <w:sz w:val="20"/>
-          <w:szCs w:val="20"/>
-        </w:rPr>
-        <w:t>judicial_officer</w:t>
-      </w:r>
-      <w:r>
-        <w:rPr>
-          <w:rFonts w:ascii="Palatino Linotype" w:hAnsi="Palatino Linotype"/>
-          <w:sz w:val="20"/>
-          <w:szCs w:val="20"/>
-        </w:rPr>
-        <w:t>.first_name</w:t>
-      </w:r>
-      <w:proofErr w:type="spellEnd"/>
-      <w:r>
-        <w:rPr>
-          <w:rFonts w:ascii="Palatino Linotype" w:hAnsi="Palatino Linotype"/>
-          <w:sz w:val="20"/>
-          <w:szCs w:val="20"/>
-        </w:rPr>
-        <w:t xml:space="preserve"> }}</w:t>
-      </w:r>
-      <w:r>
-        <w:rPr>
-          <w:rFonts w:ascii="Palatino Linotype" w:hAnsi="Palatino Linotype"/>
-          <w:sz w:val="20"/>
-          <w:szCs w:val="20"/>
-        </w:rPr>
-        <w:t xml:space="preserve"> </w:t>
-      </w:r>
-      <w:r>
-        <w:rPr>
-          <w:rFonts w:ascii="Palatino Linotype" w:hAnsi="Palatino Linotype"/>
-          <w:sz w:val="20"/>
-          <w:szCs w:val="20"/>
-        </w:rPr>
-        <w:t xml:space="preserve">{{ </w:t>
-      </w:r>
-      <w:proofErr w:type="spellStart"/>
-      <w:r>
-        <w:rPr>
-          <w:rFonts w:ascii="Palatino Linotype" w:hAnsi="Palatino Linotype"/>
-          <w:sz w:val="20"/>
-          <w:szCs w:val="20"/>
-        </w:rPr>
-        <w:t>judicial_officer</w:t>
-      </w:r>
-      <w:r>
-        <w:rPr>
-          <w:rFonts w:ascii="Palatino Linotype" w:hAnsi="Palatino Linotype"/>
-          <w:sz w:val="20"/>
-          <w:szCs w:val="20"/>
-        </w:rPr>
-        <w:t>.last_name</w:t>
-      </w:r>
-      <w:proofErr w:type="spellEnd"/>
-      <w:r>
-        <w:rPr>
-          <w:rFonts w:ascii="Palatino Linotype" w:hAnsi="Palatino Linotype"/>
-          <w:sz w:val="20"/>
-          <w:szCs w:val="20"/>
-        </w:rPr>
-        <w:t xml:space="preserve"> }}</w:t>
-      </w:r>
-    </w:p>
-    <w:p>
-      <w:pPr>
-        <w:tabs>
-          <w:tab w:val="left" w:pos="-1080"/>
-          <w:tab w:val="left" w:pos="-720"/>
-          <w:tab w:val="left" w:pos="0"/>
-          <w:tab w:val="left" w:pos="720"/>
-          <w:tab w:val="left" w:pos="1440"/>
-          <w:tab w:val="left" w:pos="2160"/>
-          <w:tab w:val="left" w:pos="2880"/>
-          <w:tab w:val="left" w:pos="3600"/>
-          <w:tab w:val="left" w:pos="4320"/>
-          <w:tab w:val="left" w:pos="4680"/>
-        </w:tabs>
-        <w:contextualSpacing/>
-        <w:rPr>
-          <w:rFonts w:ascii="Palatino Linotype" w:hAnsi="Palatino Linotype"/>
-          <w:bCs/>
-          <w:sz w:val="20"/>
-          <w:szCs w:val="20"/>
-        </w:rPr>
-      </w:pPr>
-      <w:r>
-        <w:rPr>
-          <w:rFonts w:ascii="Palatino Linotype" w:hAnsi="Palatino Linotype"/>
-          <w:sz w:val="20"/>
-          <w:szCs w:val="20"/>
-        </w:rPr>
-        <w:t>{</w:t>
-      </w:r>
-      <w:r>
-        <w:rPr>
-          <w:rFonts w:ascii="Palatino Linotype" w:hAnsi="Palatino Linotype"/>
-          <w:bCs/>
-          <w:sz w:val="20"/>
-          <w:szCs w:val="20"/>
-        </w:rPr>
-        <w:t xml:space="preserve">% if </w:t>
-      </w:r>
-      <w:proofErr w:type="spellStart"/>
-      <w:r>
-        <w:rPr>
-          <w:rFonts w:ascii="Palatino Linotype" w:hAnsi="Palatino Linotype"/>
-          <w:bCs/>
-          <w:sz w:val="20"/>
-          <w:szCs w:val="20"/>
-        </w:rPr>
-        <w:t>judicial_</w:t>
-      </w:r>
-      <w:proofErr w:type="gramStart"/>
-      <w:r>
-        <w:rPr>
-          <w:rFonts w:ascii="Palatino Linotype" w:hAnsi="Palatino Linotype"/>
-          <w:bCs/>
-          <w:sz w:val="20"/>
-          <w:szCs w:val="20"/>
-        </w:rPr>
-        <w:t>of</w:t>
-      </w:r>
-      <w:r>
-        <w:rPr>
-          <w:rFonts w:ascii="Palatino Linotype" w:hAnsi="Palatino Linotype"/>
-          <w:bCs/>
-          <w:sz w:val="20"/>
-          <w:szCs w:val="20"/>
-        </w:rPr>
-        <w:t>ficer.officer</w:t>
-      </w:r>
-      <w:proofErr w:type="gramEnd"/>
-      <w:r>
-        <w:rPr>
-          <w:rFonts w:ascii="Palatino Linotype" w:hAnsi="Palatino Linotype"/>
-          <w:bCs/>
-          <w:sz w:val="20"/>
-          <w:szCs w:val="20"/>
-        </w:rPr>
-        <w:t>_type</w:t>
-      </w:r>
-      <w:proofErr w:type="spellEnd"/>
-      <w:r>
-        <w:rPr>
-          <w:rFonts w:ascii="Palatino Linotype" w:hAnsi="Palatino Linotype"/>
-          <w:bCs/>
-          <w:sz w:val="20"/>
-          <w:szCs w:val="20"/>
-        </w:rPr>
-        <w:t xml:space="preserve">  ==  ‘Magistrate’ %}</w:t>
+        <w:t>{{ appearance_reason_subdoc }}</w:t>
       </w:r>
     </w:p>
     <w:p>
@@ -560,76 +114,26 @@
           <w:tab w:val="center" w:pos="4680"/>
         </w:tabs>
         <w:contextualSpacing/>
-        <w:jc w:val="both"/>
-        <w:rPr>
-          <w:rFonts w:ascii="Palatino Linotype" w:hAnsi="Palatino Linotype"/>
-          <w:b/>
-          <w:bCs/>
-          <w:i/>
-          <w:sz w:val="19"/>
-          <w:szCs w:val="19"/>
+        <w:rPr>
+          <w:rFonts w:ascii="Palatino Linotype" w:hAnsi="Palatino Linotype"/>
+          <w:sz w:val="20"/>
+          <w:szCs w:val="20"/>
         </w:rPr>
       </w:pPr>
       <w:r>
         <w:rPr>
           <w:rFonts w:ascii="Palatino Linotype" w:hAnsi="Palatino Linotype"/>
-          <w:b/>
-          <w:bCs/>
-          <w:i/>
-          <w:sz w:val="19"/>
-          <w:szCs w:val="19"/>
-        </w:rPr>
-        <w:t xml:space="preserve">Pursuant to Criminal Rule 19(D) and Traffic Rule 14, written objections to this magistrate’s decision must be filed within </w:t>
-      </w:r>
-      <w:r>
-        <w:rPr>
-          <w:rFonts w:ascii="Palatino Linotype" w:hAnsi="Palatino Linotype"/>
-          <w:b/>
-          <w:bCs/>
-          <w:i/>
-          <w:sz w:val="19"/>
-          <w:szCs w:val="19"/>
-        </w:rPr>
-        <w:t>14</w:t>
-      </w:r>
-      <w:r>
-        <w:rPr>
-          <w:rFonts w:ascii="Palatino Linotype" w:hAnsi="Palatino Linotype"/>
-          <w:b/>
-          <w:bCs/>
-          <w:i/>
-          <w:sz w:val="19"/>
-          <w:szCs w:val="19"/>
-        </w:rPr>
-        <w:t xml:space="preserve"> days of the filing of this decision. Any objections must state with specificity the grounds of the objections. A party shall not assign as error on appeal the court’s adoption of this decision unless the party timely </w:t>
-      </w:r>
-      <w:r>
-        <w:rPr>
-          <w:rFonts w:ascii="Palatino Linotype" w:hAnsi="Palatino Linotype"/>
-          <w:b/>
-          <w:bCs/>
-          <w:i/>
-          <w:sz w:val="19"/>
-          <w:szCs w:val="19"/>
-        </w:rPr>
-        <w:t>files objections.</w:t>
+          <w:sz w:val="20"/>
+          <w:szCs w:val="20"/>
+        </w:rPr>
+        <w:t>{{ charge_grid_subdoc }}</w:t>
       </w:r>
     </w:p>
     <w:p>
       <w:pPr>
-        <w:tabs>
-          <w:tab w:val="left" w:pos="-1080"/>
-          <w:tab w:val="left" w:pos="-720"/>
-          <w:tab w:val="left" w:pos="0"/>
-          <w:tab w:val="left" w:pos="720"/>
-          <w:tab w:val="left" w:pos="1440"/>
-          <w:tab w:val="left" w:pos="2160"/>
-          <w:tab w:val="left" w:pos="2880"/>
-          <w:tab w:val="left" w:pos="3600"/>
-          <w:tab w:val="left" w:pos="4320"/>
-          <w:tab w:val="left" w:pos="4680"/>
-        </w:tabs>
+        <w:spacing w:line="276" w:lineRule="auto"/>
         <w:contextualSpacing/>
+        <w:jc w:val="both"/>
         <w:rPr>
           <w:rFonts w:ascii="Palatino Linotype" w:hAnsi="Palatino Linotype"/>
           <w:sz w:val="20"/>
@@ -642,7 +146,47 @@
           <w:sz w:val="20"/>
           <w:szCs w:val="20"/>
         </w:rPr>
-        <w:t>{% endif %}</w:t>
+        <w:t>{{ court_costs_subdoc }}</w:t>
+      </w:r>
+    </w:p>
+    <w:p>
+      <w:pPr>
+        <w:spacing w:line="276" w:lineRule="auto"/>
+        <w:contextualSpacing/>
+        <w:jc w:val="both"/>
+        <w:rPr>
+          <w:rFonts w:ascii="Palatino Linotype" w:hAnsi="Palatino Linotype"/>
+          <w:sz w:val="20"/>
+          <w:szCs w:val="20"/>
+        </w:rPr>
+      </w:pPr>
+      <w:r>
+        <w:rPr>
+          <w:rFonts w:ascii="Palatino Linotype" w:hAnsi="Palatino Linotype"/>
+          <w:sz w:val="20"/>
+          <w:szCs w:val="20"/>
+        </w:rPr>
+        <w:t>{{ signature_subdoc }}</w:t>
+      </w:r>
+    </w:p>
+    <w:p>
+      <w:pPr>
+        <w:spacing w:line="276" w:lineRule="auto"/>
+        <w:contextualSpacing/>
+        <w:jc w:val="both"/>
+        <w:rPr>
+          <w:rFonts w:ascii="Palatino Linotype" w:hAnsi="Palatino Linotype"/>
+          <w:sz w:val="20"/>
+          <w:szCs w:val="20"/>
+        </w:rPr>
+      </w:pPr>
+      <w:r>
+        <w:rPr>
+          <w:rFonts w:ascii="Palatino Linotype" w:hAnsi="Palatino Linotype"/>
+          <w:sz w:val="20"/>
+          <w:szCs w:val="20"/>
+        </w:rPr>
+        <w:t>{{ magistrate_notice_subdoc }}</w:t>
       </w:r>
     </w:p>
     <w:p>
@@ -654,7 +198,6 @@
           <w:szCs w:val="16"/>
         </w:rPr>
       </w:pPr>
-      <w:proofErr w:type="gramStart"/>
       <w:r>
         <w:rPr>
           <w:rFonts w:ascii="Palatino Linotype" w:hAnsi="Palatino Linotype"/>
@@ -669,34 +212,7 @@
           <w:sz w:val="16"/>
           <w:szCs w:val="16"/>
         </w:rPr>
-        <w:t xml:space="preserve"> </w:t>
-      </w:r>
-      <w:proofErr w:type="spellStart"/>
-      <w:r>
-        <w:rPr>
-          <w:rFonts w:ascii="Palatino Linotype" w:hAnsi="Palatino Linotype"/>
-          <w:sz w:val="16"/>
-          <w:szCs w:val="16"/>
-        </w:rPr>
-        <w:t>service</w:t>
-      </w:r>
-      <w:proofErr w:type="gramEnd"/>
-      <w:r>
-        <w:rPr>
-          <w:rFonts w:ascii="Palatino Linotype" w:hAnsi="Palatino Linotype"/>
-          <w:sz w:val="16"/>
-          <w:szCs w:val="16"/>
-        </w:rPr>
-        <w:t>_subdoc</w:t>
-      </w:r>
-      <w:proofErr w:type="spellEnd"/>
-      <w:r>
-        <w:rPr>
-          <w:rFonts w:ascii="Palatino Linotype" w:hAnsi="Palatino Linotype"/>
-          <w:sz w:val="16"/>
-          <w:szCs w:val="16"/>
-        </w:rPr>
-        <w:t xml:space="preserve"> }}</w:t>
+        <w:t xml:space="preserve"> service_subdoc }}</w:t>
       </w:r>
     </w:p>
     <w:sectPr>
@@ -942,109 +458,15 @@
                 <w:sz w:val="20"/>
                 <w:szCs w:val="20"/>
               </w:rPr>
-              <w:t xml:space="preserve">% if </w:t>
-            </w:r>
-            <w:proofErr w:type="spellStart"/>
-            <w:r>
-              <w:rPr>
-                <w:rFonts w:ascii="Palatino Linotype" w:hAnsi="Palatino Linotype"/>
-                <w:bCs/>
-                <w:sz w:val="20"/>
-                <w:szCs w:val="20"/>
-              </w:rPr>
-              <w:t>judicial_</w:t>
-            </w:r>
-            <w:proofErr w:type="gramStart"/>
-            <w:r>
-              <w:rPr>
-                <w:rFonts w:ascii="Palatino Linotype" w:hAnsi="Palatino Linotype"/>
-                <w:bCs/>
-                <w:sz w:val="20"/>
-                <w:szCs w:val="20"/>
-              </w:rPr>
-              <w:t>officer.officer</w:t>
-            </w:r>
-            <w:proofErr w:type="gramEnd"/>
-            <w:r>
-              <w:rPr>
-                <w:rFonts w:ascii="Palatino Linotype" w:hAnsi="Palatino Linotype"/>
-                <w:bCs/>
-                <w:sz w:val="20"/>
-                <w:szCs w:val="20"/>
-              </w:rPr>
-              <w:t>_type</w:t>
-            </w:r>
-            <w:proofErr w:type="spellEnd"/>
-            <w:r>
-              <w:rPr>
-                <w:rFonts w:ascii="Palatino Linotype" w:hAnsi="Palatino Linotype"/>
-                <w:bCs/>
-                <w:sz w:val="20"/>
-                <w:szCs w:val="20"/>
-              </w:rPr>
-              <w:t xml:space="preserve">  ==  ‘Magistrate’ %}Magistrate Decision</w:t>
-            </w:r>
-            <w:r>
-              <w:rPr>
-                <w:rFonts w:ascii="Palatino Linotype" w:hAnsi="Palatino Linotype"/>
-                <w:sz w:val="20"/>
-                <w:szCs w:val="20"/>
-              </w:rPr>
-              <w:t xml:space="preserve">{% </w:t>
-            </w:r>
-            <w:proofErr w:type="spellStart"/>
-            <w:r>
-              <w:rPr>
-                <w:rFonts w:ascii="Palatino Linotype" w:hAnsi="Palatino Linotype"/>
-                <w:sz w:val="20"/>
-                <w:szCs w:val="20"/>
-              </w:rPr>
-              <w:t>elif</w:t>
-            </w:r>
-            <w:proofErr w:type="spellEnd"/>
-            <w:r>
-              <w:rPr>
-                <w:rFonts w:ascii="Palatino Linotype" w:hAnsi="Palatino Linotype"/>
-                <w:sz w:val="20"/>
-                <w:szCs w:val="20"/>
-              </w:rPr>
-              <w:t xml:space="preserve"> </w:t>
-            </w:r>
-            <w:proofErr w:type="spellStart"/>
-            <w:r>
-              <w:rPr>
-                <w:rFonts w:ascii="Palatino Linotype" w:hAnsi="Palatino Linotype"/>
-                <w:sz w:val="20"/>
-                <w:szCs w:val="20"/>
-              </w:rPr>
-              <w:t>judicial_officer.officer_type</w:t>
-            </w:r>
-            <w:proofErr w:type="spellEnd"/>
-            <w:r>
-              <w:rPr>
-                <w:rFonts w:ascii="Palatino Linotype" w:hAnsi="Palatino Linotype"/>
-                <w:sz w:val="20"/>
-                <w:szCs w:val="20"/>
-              </w:rPr>
-              <w:t xml:space="preserve"> == ‘Judge’ %}Final Judgment Entry{% endif %} {{ </w:t>
-            </w:r>
-            <w:proofErr w:type="spellStart"/>
-            <w:r>
-              <w:rPr>
-                <w:rFonts w:ascii="Palatino Linotype" w:hAnsi="Palatino Linotype"/>
-                <w:sz w:val="20"/>
-                <w:szCs w:val="20"/>
-              </w:rPr>
-              <w:t>case_number</w:t>
-            </w:r>
-            <w:proofErr w:type="spellEnd"/>
-            <w:r>
-              <w:rPr>
-                <w:rFonts w:ascii="Palatino Linotype" w:hAnsi="Palatino Linotype"/>
-                <w:sz w:val="20"/>
-                <w:szCs w:val="20"/>
-              </w:rPr>
-              <w:t xml:space="preserve"> }}</w:t>
+              <w:t>% if judicial_officer.officer_type  ==  ‘Magistrate’ %}Magistrate Decision</w:t>
+            </w:r>
+            <w:r>
+              <w:rPr>
+                <w:rFonts w:ascii="Palatino Linotype" w:hAnsi="Palatino Linotype"/>
+                <w:sz w:val="20"/>
+                <w:szCs w:val="20"/>
+              </w:rPr>
+              <w:t>{% elif judicial_officer.officer_type == ‘Judge’ %}Final Judgment Entry{% endif %} {{ case_number }}</w:t>
             </w:r>
           </w:p>
           <w:p>

</xml_diff>

<commit_message>
FineOnly working with subdocs all parts.
</commit_message>
<xml_diff>
--- a/resources/Templates/Base_Template.docx
+++ b/resources/Templates/Base_Template.docx
@@ -1,6 +1,6 @@
 
 <file path=word/document.xml><?xml version="1.0" encoding="utf-8"?>
-<w:document xmlns:wpc="http://schemas.microsoft.com/office/word/2010/wordprocessingCanvas" xmlns:cx="http://schemas.microsoft.com/office/drawing/2014/chartex" xmlns:cx1="http://schemas.microsoft.com/office/drawing/2015/9/8/chartex" xmlns:cx2="http://schemas.microsoft.com/office/drawing/2015/10/21/chartex" xmlns:cx3="http://schemas.microsoft.com/office/drawing/2016/5/9/chartex" xmlns:cx4="http://schemas.microsoft.com/office/drawing/2016/5/10/chartex" xmlns:cx5="http://schemas.microsoft.com/office/drawing/2016/5/11/chartex" xmlns:cx6="http://schemas.microsoft.com/office/drawing/2016/5/12/chartex" xmlns:cx7="http://schemas.microsoft.com/office/drawing/2016/5/13/chartex" xmlns:cx8="http://schemas.microsoft.com/office/drawing/2016/5/14/chartex" xmlns:mc="http://schemas.openxmlformats.org/markup-compatibility/2006" xmlns:aink="http://schemas.microsoft.com/office/drawing/2016/ink" xmlns:am3d="http://schemas.microsoft.com/office/drawing/2017/model3d" xmlns:o="urn:schemas-microsoft-com:office:office" xmlns:oel="http://schemas.microsoft.com/office/2019/extlst" xmlns:r="http://schemas.openxmlformats.org/officeDocument/2006/relationships" xmlns:m="http://schemas.openxmlformats.org/officeDocument/2006/math" xmlns:v="urn:schemas-microsoft-com:vml" xmlns:wp14="http://schemas.microsoft.com/office/word/2010/wordprocessingDrawing" xmlns:wp="http://schemas.openxmlformats.org/drawingml/2006/wordprocessingDrawing" xmlns:w10="urn:schemas-microsoft-com:office:word" xmlns:w="http://schemas.openxmlformats.org/wordprocessingml/2006/main" xmlns:w14="http://schemas.microsoft.com/office/word/2010/wordml" xmlns:w15="http://schemas.microsoft.com/office/word/2012/wordml" xmlns:w16cex="http://schemas.microsoft.com/office/word/2018/wordml/cex" xmlns:w16cid="http://schemas.microsoft.com/office/word/2016/wordml/cid" xmlns:w16="http://schemas.microsoft.com/office/word/2018/wordml" xmlns:w16sdtdh="http://schemas.microsoft.com/office/word/2020/wordml/sdtdatahash" xmlns:w16se="http://schemas.microsoft.com/office/word/2015/wordml/symex" xmlns:wpg="http://schemas.microsoft.com/office/word/2010/wordprocessingGroup" xmlns:wpi="http://schemas.microsoft.com/office/word/2010/wordprocessingInk" xmlns:wne="http://schemas.microsoft.com/office/word/2006/wordml" xmlns:wps="http://schemas.microsoft.com/office/word/2010/wordprocessingShape" mc:Ignorable="w14 w15 w16se w16cid w16 w16cex w16sdtdh wp14">
+<w:document xmlns:wpc="http://schemas.microsoft.com/office/word/2010/wordprocessingCanvas" xmlns:cx="http://schemas.microsoft.com/office/drawing/2014/chartex" xmlns:cx1="http://schemas.microsoft.com/office/drawing/2015/9/8/chartex" xmlns:cx2="http://schemas.microsoft.com/office/drawing/2015/10/21/chartex" xmlns:cx3="http://schemas.microsoft.com/office/drawing/2016/5/9/chartex" xmlns:cx4="http://schemas.microsoft.com/office/drawing/2016/5/10/chartex" xmlns:cx5="http://schemas.microsoft.com/office/drawing/2016/5/11/chartex" xmlns:cx6="http://schemas.microsoft.com/office/drawing/2016/5/12/chartex" xmlns:cx7="http://schemas.microsoft.com/office/drawing/2016/5/13/chartex" xmlns:cx8="http://schemas.microsoft.com/office/drawing/2016/5/14/chartex" xmlns:mc="http://schemas.openxmlformats.org/markup-compatibility/2006" xmlns:aink="http://schemas.microsoft.com/office/drawing/2016/ink" xmlns:am3d="http://schemas.microsoft.com/office/drawing/2017/model3d" xmlns:o="urn:schemas-microsoft-com:office:office" xmlns:r="http://schemas.openxmlformats.org/officeDocument/2006/relationships" xmlns:m="http://schemas.openxmlformats.org/officeDocument/2006/math" xmlns:v="urn:schemas-microsoft-com:vml" xmlns:wp14="http://schemas.microsoft.com/office/word/2010/wordprocessingDrawing" xmlns:wp="http://schemas.openxmlformats.org/drawingml/2006/wordprocessingDrawing" xmlns:w10="urn:schemas-microsoft-com:office:word" xmlns:w="http://schemas.openxmlformats.org/wordprocessingml/2006/main" xmlns:w14="http://schemas.microsoft.com/office/word/2010/wordml" xmlns:w15="http://schemas.microsoft.com/office/word/2012/wordml" xmlns:w16cex="http://schemas.microsoft.com/office/word/2018/wordml/cex" xmlns:w16cid="http://schemas.microsoft.com/office/word/2016/wordml/cid" xmlns:w16="http://schemas.microsoft.com/office/word/2018/wordml" xmlns:w16sdtdh="http://schemas.microsoft.com/office/word/2020/wordml/sdtdatahash" xmlns:w16se="http://schemas.microsoft.com/office/word/2015/wordml/symex" xmlns:wpg="http://schemas.microsoft.com/office/word/2010/wordprocessingGroup" xmlns:wpi="http://schemas.microsoft.com/office/word/2010/wordprocessingInk" xmlns:wne="http://schemas.microsoft.com/office/word/2006/wordml" xmlns:wps="http://schemas.microsoft.com/office/word/2010/wordprocessingShape" mc:Ignorable="w14 w15 w16se w16cid w16 w16cex w16sdtdh wp14">
   <w:body>
     <w:p>
       <w:pPr>
@@ -25,6 +25,7 @@
           <w:szCs w:val="20"/>
         </w:rPr>
       </w:pPr>
+      <w:proofErr w:type="gramStart"/>
       <w:r>
         <w:rPr>
           <w:rFonts w:ascii="Palatino Linotype" w:hAnsi="Palatino Linotype"/>
@@ -39,7 +40,34 @@
           <w:sz w:val="20"/>
           <w:szCs w:val="20"/>
         </w:rPr>
-        <w:t>{ caption_subdoc }}</w:t>
+        <w:t xml:space="preserve">{ </w:t>
+      </w:r>
+      <w:proofErr w:type="spellStart"/>
+      <w:r>
+        <w:rPr>
+          <w:rFonts w:ascii="Palatino Linotype" w:hAnsi="Palatino Linotype"/>
+          <w:sz w:val="20"/>
+          <w:szCs w:val="20"/>
+        </w:rPr>
+        <w:t>caption</w:t>
+      </w:r>
+      <w:proofErr w:type="gramEnd"/>
+      <w:r>
+        <w:rPr>
+          <w:rFonts w:ascii="Palatino Linotype" w:hAnsi="Palatino Linotype"/>
+          <w:sz w:val="20"/>
+          <w:szCs w:val="20"/>
+        </w:rPr>
+        <w:t>_subdoc</w:t>
+      </w:r>
+      <w:proofErr w:type="spellEnd"/>
+      <w:r>
+        <w:rPr>
+          <w:rFonts w:ascii="Palatino Linotype" w:hAnsi="Palatino Linotype"/>
+          <w:sz w:val="20"/>
+          <w:szCs w:val="20"/>
+        </w:rPr>
+        <w:t xml:space="preserve"> }}</w:t>
       </w:r>
     </w:p>
     <w:p>
@@ -66,13 +94,41 @@
           <w:szCs w:val="20"/>
         </w:rPr>
       </w:pPr>
-      <w:r>
-        <w:rPr>
-          <w:rFonts w:ascii="Palatino Linotype" w:hAnsi="Palatino Linotype"/>
-          <w:sz w:val="20"/>
-          <w:szCs w:val="20"/>
-        </w:rPr>
-        <w:t>{{ document_title_subdoc }}</w:t>
+      <w:proofErr w:type="gramStart"/>
+      <w:r>
+        <w:rPr>
+          <w:rFonts w:ascii="Palatino Linotype" w:hAnsi="Palatino Linotype"/>
+          <w:sz w:val="20"/>
+          <w:szCs w:val="20"/>
+        </w:rPr>
+        <w:t xml:space="preserve">{{ </w:t>
+      </w:r>
+      <w:proofErr w:type="spellStart"/>
+      <w:r>
+        <w:rPr>
+          <w:rFonts w:ascii="Palatino Linotype" w:hAnsi="Palatino Linotype"/>
+          <w:sz w:val="20"/>
+          <w:szCs w:val="20"/>
+        </w:rPr>
+        <w:t>document</w:t>
+      </w:r>
+      <w:proofErr w:type="gramEnd"/>
+      <w:r>
+        <w:rPr>
+          <w:rFonts w:ascii="Palatino Linotype" w:hAnsi="Palatino Linotype"/>
+          <w:sz w:val="20"/>
+          <w:szCs w:val="20"/>
+        </w:rPr>
+        <w:t>_title_subdoc</w:t>
+      </w:r>
+      <w:proofErr w:type="spellEnd"/>
+      <w:r>
+        <w:rPr>
+          <w:rFonts w:ascii="Palatino Linotype" w:hAnsi="Palatino Linotype"/>
+          <w:sz w:val="20"/>
+          <w:szCs w:val="20"/>
+        </w:rPr>
+        <w:t xml:space="preserve"> }}</w:t>
       </w:r>
     </w:p>
     <w:p>
@@ -99,13 +155,41 @@
           <w:szCs w:val="20"/>
         </w:rPr>
       </w:pPr>
-      <w:r>
-        <w:rPr>
-          <w:rFonts w:ascii="Palatino Linotype" w:hAnsi="Palatino Linotype"/>
-          <w:sz w:val="20"/>
-          <w:szCs w:val="20"/>
-        </w:rPr>
-        <w:t>{{ appearance_reason_subdoc }}</w:t>
+      <w:proofErr w:type="gramStart"/>
+      <w:r>
+        <w:rPr>
+          <w:rFonts w:ascii="Palatino Linotype" w:hAnsi="Palatino Linotype"/>
+          <w:sz w:val="20"/>
+          <w:szCs w:val="20"/>
+        </w:rPr>
+        <w:t xml:space="preserve">{{ </w:t>
+      </w:r>
+      <w:proofErr w:type="spellStart"/>
+      <w:r>
+        <w:rPr>
+          <w:rFonts w:ascii="Palatino Linotype" w:hAnsi="Palatino Linotype"/>
+          <w:sz w:val="20"/>
+          <w:szCs w:val="20"/>
+        </w:rPr>
+        <w:t>appearance</w:t>
+      </w:r>
+      <w:proofErr w:type="gramEnd"/>
+      <w:r>
+        <w:rPr>
+          <w:rFonts w:ascii="Palatino Linotype" w:hAnsi="Palatino Linotype"/>
+          <w:sz w:val="20"/>
+          <w:szCs w:val="20"/>
+        </w:rPr>
+        <w:t>_reason_subdoc</w:t>
+      </w:r>
+      <w:proofErr w:type="spellEnd"/>
+      <w:r>
+        <w:rPr>
+          <w:rFonts w:ascii="Palatino Linotype" w:hAnsi="Palatino Linotype"/>
+          <w:sz w:val="20"/>
+          <w:szCs w:val="20"/>
+        </w:rPr>
+        <w:t xml:space="preserve"> }}</w:t>
       </w:r>
     </w:p>
     <w:p>
@@ -120,13 +204,41 @@
           <w:szCs w:val="20"/>
         </w:rPr>
       </w:pPr>
-      <w:r>
-        <w:rPr>
-          <w:rFonts w:ascii="Palatino Linotype" w:hAnsi="Palatino Linotype"/>
-          <w:sz w:val="20"/>
-          <w:szCs w:val="20"/>
-        </w:rPr>
-        <w:t>{{ charge_grid_subdoc }}</w:t>
+      <w:proofErr w:type="gramStart"/>
+      <w:r>
+        <w:rPr>
+          <w:rFonts w:ascii="Palatino Linotype" w:hAnsi="Palatino Linotype"/>
+          <w:sz w:val="20"/>
+          <w:szCs w:val="20"/>
+        </w:rPr>
+        <w:t xml:space="preserve">{{ </w:t>
+      </w:r>
+      <w:proofErr w:type="spellStart"/>
+      <w:r>
+        <w:rPr>
+          <w:rFonts w:ascii="Palatino Linotype" w:hAnsi="Palatino Linotype"/>
+          <w:sz w:val="20"/>
+          <w:szCs w:val="20"/>
+        </w:rPr>
+        <w:t>charge</w:t>
+      </w:r>
+      <w:proofErr w:type="gramEnd"/>
+      <w:r>
+        <w:rPr>
+          <w:rFonts w:ascii="Palatino Linotype" w:hAnsi="Palatino Linotype"/>
+          <w:sz w:val="20"/>
+          <w:szCs w:val="20"/>
+        </w:rPr>
+        <w:t>_grid_subdoc</w:t>
+      </w:r>
+      <w:proofErr w:type="spellEnd"/>
+      <w:r>
+        <w:rPr>
+          <w:rFonts w:ascii="Palatino Linotype" w:hAnsi="Palatino Linotype"/>
+          <w:sz w:val="20"/>
+          <w:szCs w:val="20"/>
+        </w:rPr>
+        <w:t xml:space="preserve"> }}</w:t>
       </w:r>
     </w:p>
     <w:p>
@@ -140,13 +252,41 @@
           <w:szCs w:val="20"/>
         </w:rPr>
       </w:pPr>
-      <w:r>
-        <w:rPr>
-          <w:rFonts w:ascii="Palatino Linotype" w:hAnsi="Palatino Linotype"/>
-          <w:sz w:val="20"/>
-          <w:szCs w:val="20"/>
-        </w:rPr>
-        <w:t>{{ court_costs_subdoc }}</w:t>
+      <w:proofErr w:type="gramStart"/>
+      <w:r>
+        <w:rPr>
+          <w:rFonts w:ascii="Palatino Linotype" w:hAnsi="Palatino Linotype"/>
+          <w:sz w:val="20"/>
+          <w:szCs w:val="20"/>
+        </w:rPr>
+        <w:t xml:space="preserve">{{ </w:t>
+      </w:r>
+      <w:proofErr w:type="spellStart"/>
+      <w:r>
+        <w:rPr>
+          <w:rFonts w:ascii="Palatino Linotype" w:hAnsi="Palatino Linotype"/>
+          <w:sz w:val="20"/>
+          <w:szCs w:val="20"/>
+        </w:rPr>
+        <w:t>court</w:t>
+      </w:r>
+      <w:proofErr w:type="gramEnd"/>
+      <w:r>
+        <w:rPr>
+          <w:rFonts w:ascii="Palatino Linotype" w:hAnsi="Palatino Linotype"/>
+          <w:sz w:val="20"/>
+          <w:szCs w:val="20"/>
+        </w:rPr>
+        <w:t>_costs_subdoc</w:t>
+      </w:r>
+      <w:proofErr w:type="spellEnd"/>
+      <w:r>
+        <w:rPr>
+          <w:rFonts w:ascii="Palatino Linotype" w:hAnsi="Palatino Linotype"/>
+          <w:sz w:val="20"/>
+          <w:szCs w:val="20"/>
+        </w:rPr>
+        <w:t xml:space="preserve"> }}</w:t>
       </w:r>
     </w:p>
     <w:p>
@@ -166,7 +306,25 @@
           <w:sz w:val="20"/>
           <w:szCs w:val="20"/>
         </w:rPr>
-        <w:t>{{ signature_subdoc }}</w:t>
+        <w:t xml:space="preserve">{{ </w:t>
+      </w:r>
+      <w:proofErr w:type="spellStart"/>
+      <w:r>
+        <w:rPr>
+          <w:rFonts w:ascii="Palatino Linotype" w:hAnsi="Palatino Linotype"/>
+          <w:sz w:val="20"/>
+          <w:szCs w:val="20"/>
+        </w:rPr>
+        <w:t>additional_conditions_subdoc</w:t>
+      </w:r>
+      <w:proofErr w:type="spellEnd"/>
+      <w:r>
+        <w:rPr>
+          <w:rFonts w:ascii="Palatino Linotype" w:hAnsi="Palatino Linotype"/>
+          <w:sz w:val="20"/>
+          <w:szCs w:val="20"/>
+        </w:rPr>
+        <w:t xml:space="preserve"> }}</w:t>
       </w:r>
     </w:p>
     <w:p>
@@ -180,13 +338,137 @@
           <w:szCs w:val="20"/>
         </w:rPr>
       </w:pPr>
-      <w:r>
-        <w:rPr>
-          <w:rFonts w:ascii="Palatino Linotype" w:hAnsi="Palatino Linotype"/>
-          <w:sz w:val="20"/>
-          <w:szCs w:val="20"/>
-        </w:rPr>
-        <w:t>{{ magistrate_notice_subdoc }}</w:t>
+      <w:proofErr w:type="gramStart"/>
+      <w:r>
+        <w:rPr>
+          <w:rFonts w:ascii="Palatino Linotype" w:hAnsi="Palatino Linotype"/>
+          <w:sz w:val="20"/>
+          <w:szCs w:val="20"/>
+        </w:rPr>
+        <w:t xml:space="preserve">{{ </w:t>
+      </w:r>
+      <w:proofErr w:type="spellStart"/>
+      <w:r>
+        <w:rPr>
+          <w:rFonts w:ascii="Palatino Linotype" w:hAnsi="Palatino Linotype"/>
+          <w:sz w:val="20"/>
+          <w:szCs w:val="20"/>
+        </w:rPr>
+        <w:t>financial</w:t>
+      </w:r>
+      <w:proofErr w:type="gramEnd"/>
+      <w:r>
+        <w:rPr>
+          <w:rFonts w:ascii="Palatino Linotype" w:hAnsi="Palatino Linotype"/>
+          <w:sz w:val="20"/>
+          <w:szCs w:val="20"/>
+        </w:rPr>
+        <w:t>_responsibility_subdoc</w:t>
+      </w:r>
+      <w:proofErr w:type="spellEnd"/>
+      <w:r>
+        <w:rPr>
+          <w:rFonts w:ascii="Palatino Linotype" w:hAnsi="Palatino Linotype"/>
+          <w:sz w:val="20"/>
+          <w:szCs w:val="20"/>
+        </w:rPr>
+        <w:t xml:space="preserve"> }}</w:t>
+      </w:r>
+    </w:p>
+    <w:p>
+      <w:pPr>
+        <w:spacing w:line="276" w:lineRule="auto"/>
+        <w:contextualSpacing/>
+        <w:jc w:val="both"/>
+        <w:rPr>
+          <w:rFonts w:ascii="Palatino Linotype" w:hAnsi="Palatino Linotype"/>
+          <w:sz w:val="20"/>
+          <w:szCs w:val="20"/>
+        </w:rPr>
+      </w:pPr>
+      <w:proofErr w:type="gramStart"/>
+      <w:r>
+        <w:rPr>
+          <w:rFonts w:ascii="Palatino Linotype" w:hAnsi="Palatino Linotype"/>
+          <w:sz w:val="20"/>
+          <w:szCs w:val="20"/>
+        </w:rPr>
+        <w:t xml:space="preserve">{{ </w:t>
+      </w:r>
+      <w:proofErr w:type="spellStart"/>
+      <w:r>
+        <w:rPr>
+          <w:rFonts w:ascii="Palatino Linotype" w:hAnsi="Palatino Linotype"/>
+          <w:sz w:val="20"/>
+          <w:szCs w:val="20"/>
+        </w:rPr>
+        <w:t>signature</w:t>
+      </w:r>
+      <w:proofErr w:type="gramEnd"/>
+      <w:r>
+        <w:rPr>
+          <w:rFonts w:ascii="Palatino Linotype" w:hAnsi="Palatino Linotype"/>
+          <w:sz w:val="20"/>
+          <w:szCs w:val="20"/>
+        </w:rPr>
+        <w:t>_subdoc</w:t>
+      </w:r>
+      <w:proofErr w:type="spellEnd"/>
+      <w:r>
+        <w:rPr>
+          <w:rFonts w:ascii="Palatino Linotype" w:hAnsi="Palatino Linotype"/>
+          <w:sz w:val="20"/>
+          <w:szCs w:val="20"/>
+        </w:rPr>
+        <w:t xml:space="preserve"> }}</w:t>
+      </w:r>
+    </w:p>
+    <w:p>
+      <w:pPr>
+        <w:spacing w:line="276" w:lineRule="auto"/>
+        <w:contextualSpacing/>
+        <w:jc w:val="both"/>
+        <w:rPr>
+          <w:rFonts w:ascii="Palatino Linotype" w:hAnsi="Palatino Linotype"/>
+          <w:sz w:val="20"/>
+          <w:szCs w:val="20"/>
+        </w:rPr>
+      </w:pPr>
+      <w:proofErr w:type="gramStart"/>
+      <w:r>
+        <w:rPr>
+          <w:rFonts w:ascii="Palatino Linotype" w:hAnsi="Palatino Linotype"/>
+          <w:sz w:val="20"/>
+          <w:szCs w:val="20"/>
+        </w:rPr>
+        <w:t xml:space="preserve">{{ </w:t>
+      </w:r>
+      <w:proofErr w:type="spellStart"/>
+      <w:r>
+        <w:rPr>
+          <w:rFonts w:ascii="Palatino Linotype" w:hAnsi="Palatino Linotype"/>
+          <w:sz w:val="20"/>
+          <w:szCs w:val="20"/>
+        </w:rPr>
+        <w:t>magistrate</w:t>
+      </w:r>
+      <w:proofErr w:type="gramEnd"/>
+      <w:r>
+        <w:rPr>
+          <w:rFonts w:ascii="Palatino Linotype" w:hAnsi="Palatino Linotype"/>
+          <w:sz w:val="20"/>
+          <w:szCs w:val="20"/>
+        </w:rPr>
+        <w:t>_notice_subdoc</w:t>
+      </w:r>
+      <w:proofErr w:type="spellEnd"/>
+      <w:r>
+        <w:rPr>
+          <w:rFonts w:ascii="Palatino Linotype" w:hAnsi="Palatino Linotype"/>
+          <w:sz w:val="20"/>
+          <w:szCs w:val="20"/>
+        </w:rPr>
+        <w:t xml:space="preserve"> }}</w:t>
       </w:r>
     </w:p>
     <w:p>
@@ -198,6 +480,7 @@
           <w:szCs w:val="16"/>
         </w:rPr>
       </w:pPr>
+      <w:proofErr w:type="gramStart"/>
       <w:r>
         <w:rPr>
           <w:rFonts w:ascii="Palatino Linotype" w:hAnsi="Palatino Linotype"/>
@@ -212,7 +495,34 @@
           <w:sz w:val="16"/>
           <w:szCs w:val="16"/>
         </w:rPr>
-        <w:t xml:space="preserve"> service_subdoc }}</w:t>
+        <w:t xml:space="preserve"> </w:t>
+      </w:r>
+      <w:proofErr w:type="spellStart"/>
+      <w:r>
+        <w:rPr>
+          <w:rFonts w:ascii="Palatino Linotype" w:hAnsi="Palatino Linotype"/>
+          <w:sz w:val="16"/>
+          <w:szCs w:val="16"/>
+        </w:rPr>
+        <w:t>service</w:t>
+      </w:r>
+      <w:proofErr w:type="gramEnd"/>
+      <w:r>
+        <w:rPr>
+          <w:rFonts w:ascii="Palatino Linotype" w:hAnsi="Palatino Linotype"/>
+          <w:sz w:val="16"/>
+          <w:szCs w:val="16"/>
+        </w:rPr>
+        <w:t>_subdoc</w:t>
+      </w:r>
+      <w:proofErr w:type="spellEnd"/>
+      <w:r>
+        <w:rPr>
+          <w:rFonts w:ascii="Palatino Linotype" w:hAnsi="Palatino Linotype"/>
+          <w:sz w:val="16"/>
+          <w:szCs w:val="16"/>
+        </w:rPr>
+        <w:t xml:space="preserve"> }}</w:t>
       </w:r>
     </w:p>
     <w:sectPr>
@@ -233,7 +543,7 @@
 </file>
 
 <file path=word/endnotes.xml><?xml version="1.0" encoding="utf-8"?>
-<w:endnotes xmlns:wpc="http://schemas.microsoft.com/office/word/2010/wordprocessingCanvas" xmlns:cx="http://schemas.microsoft.com/office/drawing/2014/chartex" xmlns:cx1="http://schemas.microsoft.com/office/drawing/2015/9/8/chartex" xmlns:cx2="http://schemas.microsoft.com/office/drawing/2015/10/21/chartex" xmlns:cx3="http://schemas.microsoft.com/office/drawing/2016/5/9/chartex" xmlns:cx4="http://schemas.microsoft.com/office/drawing/2016/5/10/chartex" xmlns:cx5="http://schemas.microsoft.com/office/drawing/2016/5/11/chartex" xmlns:cx6="http://schemas.microsoft.com/office/drawing/2016/5/12/chartex" xmlns:cx7="http://schemas.microsoft.com/office/drawing/2016/5/13/chartex" xmlns:cx8="http://schemas.microsoft.com/office/drawing/2016/5/14/chartex" xmlns:mc="http://schemas.openxmlformats.org/markup-compatibility/2006" xmlns:aink="http://schemas.microsoft.com/office/drawing/2016/ink" xmlns:am3d="http://schemas.microsoft.com/office/drawing/2017/model3d" xmlns:o="urn:schemas-microsoft-com:office:office" xmlns:oel="http://schemas.microsoft.com/office/2019/extlst" xmlns:r="http://schemas.openxmlformats.org/officeDocument/2006/relationships" xmlns:m="http://schemas.openxmlformats.org/officeDocument/2006/math" xmlns:v="urn:schemas-microsoft-com:vml" xmlns:wp14="http://schemas.microsoft.com/office/word/2010/wordprocessingDrawing" xmlns:wp="http://schemas.openxmlformats.org/drawingml/2006/wordprocessingDrawing" xmlns:w10="urn:schemas-microsoft-com:office:word" xmlns:w="http://schemas.openxmlformats.org/wordprocessingml/2006/main" xmlns:w14="http://schemas.microsoft.com/office/word/2010/wordml" xmlns:w15="http://schemas.microsoft.com/office/word/2012/wordml" xmlns:w16cex="http://schemas.microsoft.com/office/word/2018/wordml/cex" xmlns:w16cid="http://schemas.microsoft.com/office/word/2016/wordml/cid" xmlns:w16="http://schemas.microsoft.com/office/word/2018/wordml" xmlns:w16sdtdh="http://schemas.microsoft.com/office/word/2020/wordml/sdtdatahash" xmlns:w16se="http://schemas.microsoft.com/office/word/2015/wordml/symex" xmlns:wpg="http://schemas.microsoft.com/office/word/2010/wordprocessingGroup" xmlns:wpi="http://schemas.microsoft.com/office/word/2010/wordprocessingInk" xmlns:wne="http://schemas.microsoft.com/office/word/2006/wordml" xmlns:wps="http://schemas.microsoft.com/office/word/2010/wordprocessingShape" mc:Ignorable="w14 w15 w16se w16cid w16 w16cex w16sdtdh wp14">
+<w:endnotes xmlns:wpc="http://schemas.microsoft.com/office/word/2010/wordprocessingCanvas" xmlns:cx="http://schemas.microsoft.com/office/drawing/2014/chartex" xmlns:cx1="http://schemas.microsoft.com/office/drawing/2015/9/8/chartex" xmlns:cx2="http://schemas.microsoft.com/office/drawing/2015/10/21/chartex" xmlns:cx3="http://schemas.microsoft.com/office/drawing/2016/5/9/chartex" xmlns:cx4="http://schemas.microsoft.com/office/drawing/2016/5/10/chartex" xmlns:cx5="http://schemas.microsoft.com/office/drawing/2016/5/11/chartex" xmlns:cx6="http://schemas.microsoft.com/office/drawing/2016/5/12/chartex" xmlns:cx7="http://schemas.microsoft.com/office/drawing/2016/5/13/chartex" xmlns:cx8="http://schemas.microsoft.com/office/drawing/2016/5/14/chartex" xmlns:mc="http://schemas.openxmlformats.org/markup-compatibility/2006" xmlns:aink="http://schemas.microsoft.com/office/drawing/2016/ink" xmlns:am3d="http://schemas.microsoft.com/office/drawing/2017/model3d" xmlns:o="urn:schemas-microsoft-com:office:office" xmlns:r="http://schemas.openxmlformats.org/officeDocument/2006/relationships" xmlns:m="http://schemas.openxmlformats.org/officeDocument/2006/math" xmlns:v="urn:schemas-microsoft-com:vml" xmlns:wp14="http://schemas.microsoft.com/office/word/2010/wordprocessingDrawing" xmlns:wp="http://schemas.openxmlformats.org/drawingml/2006/wordprocessingDrawing" xmlns:w10="urn:schemas-microsoft-com:office:word" xmlns:w="http://schemas.openxmlformats.org/wordprocessingml/2006/main" xmlns:w14="http://schemas.microsoft.com/office/word/2010/wordml" xmlns:w15="http://schemas.microsoft.com/office/word/2012/wordml" xmlns:w16cex="http://schemas.microsoft.com/office/word/2018/wordml/cex" xmlns:w16cid="http://schemas.microsoft.com/office/word/2016/wordml/cid" xmlns:w16="http://schemas.microsoft.com/office/word/2018/wordml" xmlns:w16sdtdh="http://schemas.microsoft.com/office/word/2020/wordml/sdtdatahash" xmlns:w16se="http://schemas.microsoft.com/office/word/2015/wordml/symex" xmlns:wpg="http://schemas.microsoft.com/office/word/2010/wordprocessingGroup" xmlns:wpi="http://schemas.microsoft.com/office/word/2010/wordprocessingInk" xmlns:wne="http://schemas.microsoft.com/office/word/2006/wordml" xmlns:wps="http://schemas.microsoft.com/office/word/2010/wordprocessingShape" mc:Ignorable="w14 w15 w16se w16cid w16 w16cex w16sdtdh wp14">
   <w:endnote w:type="separator" w:id="-1">
     <w:p>
       <w:r>
@@ -252,7 +562,7 @@
 </file>
 
 <file path=word/footer1.xml><?xml version="1.0" encoding="utf-8"?>
-<w:ftr xmlns:wpc="http://schemas.microsoft.com/office/word/2010/wordprocessingCanvas" xmlns:cx="http://schemas.microsoft.com/office/drawing/2014/chartex" xmlns:cx1="http://schemas.microsoft.com/office/drawing/2015/9/8/chartex" xmlns:cx2="http://schemas.microsoft.com/office/drawing/2015/10/21/chartex" xmlns:cx3="http://schemas.microsoft.com/office/drawing/2016/5/9/chartex" xmlns:cx4="http://schemas.microsoft.com/office/drawing/2016/5/10/chartex" xmlns:cx5="http://schemas.microsoft.com/office/drawing/2016/5/11/chartex" xmlns:cx6="http://schemas.microsoft.com/office/drawing/2016/5/12/chartex" xmlns:cx7="http://schemas.microsoft.com/office/drawing/2016/5/13/chartex" xmlns:cx8="http://schemas.microsoft.com/office/drawing/2016/5/14/chartex" xmlns:mc="http://schemas.openxmlformats.org/markup-compatibility/2006" xmlns:aink="http://schemas.microsoft.com/office/drawing/2016/ink" xmlns:am3d="http://schemas.microsoft.com/office/drawing/2017/model3d" xmlns:o="urn:schemas-microsoft-com:office:office" xmlns:oel="http://schemas.microsoft.com/office/2019/extlst" xmlns:r="http://schemas.openxmlformats.org/officeDocument/2006/relationships" xmlns:m="http://schemas.openxmlformats.org/officeDocument/2006/math" xmlns:v="urn:schemas-microsoft-com:vml" xmlns:wp14="http://schemas.microsoft.com/office/word/2010/wordprocessingDrawing" xmlns:wp="http://schemas.openxmlformats.org/drawingml/2006/wordprocessingDrawing" xmlns:w10="urn:schemas-microsoft-com:office:word" xmlns:w="http://schemas.openxmlformats.org/wordprocessingml/2006/main" xmlns:w14="http://schemas.microsoft.com/office/word/2010/wordml" xmlns:w15="http://schemas.microsoft.com/office/word/2012/wordml" xmlns:w16cex="http://schemas.microsoft.com/office/word/2018/wordml/cex" xmlns:w16cid="http://schemas.microsoft.com/office/word/2016/wordml/cid" xmlns:w16="http://schemas.microsoft.com/office/word/2018/wordml" xmlns:w16sdtdh="http://schemas.microsoft.com/office/word/2020/wordml/sdtdatahash" xmlns:w16se="http://schemas.microsoft.com/office/word/2015/wordml/symex" xmlns:wpg="http://schemas.microsoft.com/office/word/2010/wordprocessingGroup" xmlns:wpi="http://schemas.microsoft.com/office/word/2010/wordprocessingInk" xmlns:wne="http://schemas.microsoft.com/office/word/2006/wordml" xmlns:wps="http://schemas.microsoft.com/office/word/2010/wordprocessingShape" mc:Ignorable="w14 w15 w16se w16cid w16 w16cex w16sdtdh wp14">
+<w:ftr xmlns:wpc="http://schemas.microsoft.com/office/word/2010/wordprocessingCanvas" xmlns:cx="http://schemas.microsoft.com/office/drawing/2014/chartex" xmlns:cx1="http://schemas.microsoft.com/office/drawing/2015/9/8/chartex" xmlns:cx2="http://schemas.microsoft.com/office/drawing/2015/10/21/chartex" xmlns:cx3="http://schemas.microsoft.com/office/drawing/2016/5/9/chartex" xmlns:cx4="http://schemas.microsoft.com/office/drawing/2016/5/10/chartex" xmlns:cx5="http://schemas.microsoft.com/office/drawing/2016/5/11/chartex" xmlns:cx6="http://schemas.microsoft.com/office/drawing/2016/5/12/chartex" xmlns:cx7="http://schemas.microsoft.com/office/drawing/2016/5/13/chartex" xmlns:cx8="http://schemas.microsoft.com/office/drawing/2016/5/14/chartex" xmlns:mc="http://schemas.openxmlformats.org/markup-compatibility/2006" xmlns:aink="http://schemas.microsoft.com/office/drawing/2016/ink" xmlns:am3d="http://schemas.microsoft.com/office/drawing/2017/model3d" xmlns:o="urn:schemas-microsoft-com:office:office" xmlns:r="http://schemas.openxmlformats.org/officeDocument/2006/relationships" xmlns:m="http://schemas.openxmlformats.org/officeDocument/2006/math" xmlns:v="urn:schemas-microsoft-com:vml" xmlns:wp14="http://schemas.microsoft.com/office/word/2010/wordprocessingDrawing" xmlns:wp="http://schemas.openxmlformats.org/drawingml/2006/wordprocessingDrawing" xmlns:w10="urn:schemas-microsoft-com:office:word" xmlns:w="http://schemas.openxmlformats.org/wordprocessingml/2006/main" xmlns:w14="http://schemas.microsoft.com/office/word/2010/wordml" xmlns:w15="http://schemas.microsoft.com/office/word/2012/wordml" xmlns:w16cex="http://schemas.microsoft.com/office/word/2018/wordml/cex" xmlns:w16cid="http://schemas.microsoft.com/office/word/2016/wordml/cid" xmlns:w16="http://schemas.microsoft.com/office/word/2018/wordml" xmlns:w16sdtdh="http://schemas.microsoft.com/office/word/2020/wordml/sdtdatahash" xmlns:w16se="http://schemas.microsoft.com/office/word/2015/wordml/symex" xmlns:wpg="http://schemas.microsoft.com/office/word/2010/wordprocessingGroup" xmlns:wpi="http://schemas.microsoft.com/office/word/2010/wordprocessingInk" xmlns:wne="http://schemas.microsoft.com/office/word/2006/wordml" xmlns:wps="http://schemas.microsoft.com/office/word/2010/wordprocessingShape" mc:Ignorable="w14 w15 w16se w16cid w16 w16cex w16sdtdh wp14">
   <w:p>
     <w:pPr>
       <w:pStyle w:val="Footer"/>
@@ -262,7 +572,7 @@
 </file>
 
 <file path=word/footer2.xml><?xml version="1.0" encoding="utf-8"?>
-<w:ftr xmlns:wpc="http://schemas.microsoft.com/office/word/2010/wordprocessingCanvas" xmlns:cx="http://schemas.microsoft.com/office/drawing/2014/chartex" xmlns:cx1="http://schemas.microsoft.com/office/drawing/2015/9/8/chartex" xmlns:cx2="http://schemas.microsoft.com/office/drawing/2015/10/21/chartex" xmlns:cx3="http://schemas.microsoft.com/office/drawing/2016/5/9/chartex" xmlns:cx4="http://schemas.microsoft.com/office/drawing/2016/5/10/chartex" xmlns:cx5="http://schemas.microsoft.com/office/drawing/2016/5/11/chartex" xmlns:cx6="http://schemas.microsoft.com/office/drawing/2016/5/12/chartex" xmlns:cx7="http://schemas.microsoft.com/office/drawing/2016/5/13/chartex" xmlns:cx8="http://schemas.microsoft.com/office/drawing/2016/5/14/chartex" xmlns:mc="http://schemas.openxmlformats.org/markup-compatibility/2006" xmlns:aink="http://schemas.microsoft.com/office/drawing/2016/ink" xmlns:am3d="http://schemas.microsoft.com/office/drawing/2017/model3d" xmlns:o="urn:schemas-microsoft-com:office:office" xmlns:oel="http://schemas.microsoft.com/office/2019/extlst" xmlns:r="http://schemas.openxmlformats.org/officeDocument/2006/relationships" xmlns:m="http://schemas.openxmlformats.org/officeDocument/2006/math" xmlns:v="urn:schemas-microsoft-com:vml" xmlns:wp14="http://schemas.microsoft.com/office/word/2010/wordprocessingDrawing" xmlns:wp="http://schemas.openxmlformats.org/drawingml/2006/wordprocessingDrawing" xmlns:w10="urn:schemas-microsoft-com:office:word" xmlns:w="http://schemas.openxmlformats.org/wordprocessingml/2006/main" xmlns:w14="http://schemas.microsoft.com/office/word/2010/wordml" xmlns:w15="http://schemas.microsoft.com/office/word/2012/wordml" xmlns:w16cex="http://schemas.microsoft.com/office/word/2018/wordml/cex" xmlns:w16cid="http://schemas.microsoft.com/office/word/2016/wordml/cid" xmlns:w16="http://schemas.microsoft.com/office/word/2018/wordml" xmlns:w16sdtdh="http://schemas.microsoft.com/office/word/2020/wordml/sdtdatahash" xmlns:w16se="http://schemas.microsoft.com/office/word/2015/wordml/symex" xmlns:wpg="http://schemas.microsoft.com/office/word/2010/wordprocessingGroup" xmlns:wpi="http://schemas.microsoft.com/office/word/2010/wordprocessingInk" xmlns:wne="http://schemas.microsoft.com/office/word/2006/wordml" xmlns:wps="http://schemas.microsoft.com/office/word/2010/wordprocessingShape" mc:Ignorable="w14 w15 w16se w16cid w16 w16cex w16sdtdh wp14">
+<w:ftr xmlns:wpc="http://schemas.microsoft.com/office/word/2010/wordprocessingCanvas" xmlns:cx="http://schemas.microsoft.com/office/drawing/2014/chartex" xmlns:cx1="http://schemas.microsoft.com/office/drawing/2015/9/8/chartex" xmlns:cx2="http://schemas.microsoft.com/office/drawing/2015/10/21/chartex" xmlns:cx3="http://schemas.microsoft.com/office/drawing/2016/5/9/chartex" xmlns:cx4="http://schemas.microsoft.com/office/drawing/2016/5/10/chartex" xmlns:cx5="http://schemas.microsoft.com/office/drawing/2016/5/11/chartex" xmlns:cx6="http://schemas.microsoft.com/office/drawing/2016/5/12/chartex" xmlns:cx7="http://schemas.microsoft.com/office/drawing/2016/5/13/chartex" xmlns:cx8="http://schemas.microsoft.com/office/drawing/2016/5/14/chartex" xmlns:mc="http://schemas.openxmlformats.org/markup-compatibility/2006" xmlns:aink="http://schemas.microsoft.com/office/drawing/2016/ink" xmlns:am3d="http://schemas.microsoft.com/office/drawing/2017/model3d" xmlns:o="urn:schemas-microsoft-com:office:office" xmlns:r="http://schemas.openxmlformats.org/officeDocument/2006/relationships" xmlns:m="http://schemas.openxmlformats.org/officeDocument/2006/math" xmlns:v="urn:schemas-microsoft-com:vml" xmlns:wp14="http://schemas.microsoft.com/office/word/2010/wordprocessingDrawing" xmlns:wp="http://schemas.openxmlformats.org/drawingml/2006/wordprocessingDrawing" xmlns:w10="urn:schemas-microsoft-com:office:word" xmlns:w="http://schemas.openxmlformats.org/wordprocessingml/2006/main" xmlns:w14="http://schemas.microsoft.com/office/word/2010/wordml" xmlns:w15="http://schemas.microsoft.com/office/word/2012/wordml" xmlns:w16cex="http://schemas.microsoft.com/office/word/2018/wordml/cex" xmlns:w16cid="http://schemas.microsoft.com/office/word/2016/wordml/cid" xmlns:w16="http://schemas.microsoft.com/office/word/2018/wordml" xmlns:w16sdtdh="http://schemas.microsoft.com/office/word/2020/wordml/sdtdatahash" xmlns:w16se="http://schemas.microsoft.com/office/word/2015/wordml/symex" xmlns:wpg="http://schemas.microsoft.com/office/word/2010/wordprocessingGroup" xmlns:wpi="http://schemas.microsoft.com/office/word/2010/wordprocessingInk" xmlns:wne="http://schemas.microsoft.com/office/word/2006/wordml" xmlns:wps="http://schemas.microsoft.com/office/word/2010/wordprocessingShape" mc:Ignorable="w14 w15 w16se w16cid w16 w16cex w16sdtdh wp14">
   <w:sdt>
     <w:sdtPr>
       <w:id w:val="-1309706245"/>
@@ -458,15 +768,109 @@
                 <w:sz w:val="20"/>
                 <w:szCs w:val="20"/>
               </w:rPr>
-              <w:t>% if judicial_officer.officer_type  ==  ‘Magistrate’ %}Magistrate Decision</w:t>
-            </w:r>
-            <w:r>
-              <w:rPr>
-                <w:rFonts w:ascii="Palatino Linotype" w:hAnsi="Palatino Linotype"/>
-                <w:sz w:val="20"/>
-                <w:szCs w:val="20"/>
-              </w:rPr>
-              <w:t>{% elif judicial_officer.officer_type == ‘Judge’ %}Final Judgment Entry{% endif %} {{ case_number }}</w:t>
+              <w:t xml:space="preserve">% if </w:t>
+            </w:r>
+            <w:proofErr w:type="spellStart"/>
+            <w:r>
+              <w:rPr>
+                <w:rFonts w:ascii="Palatino Linotype" w:hAnsi="Palatino Linotype"/>
+                <w:bCs/>
+                <w:sz w:val="20"/>
+                <w:szCs w:val="20"/>
+              </w:rPr>
+              <w:t>judicial_</w:t>
+            </w:r>
+            <w:proofErr w:type="gramStart"/>
+            <w:r>
+              <w:rPr>
+                <w:rFonts w:ascii="Palatino Linotype" w:hAnsi="Palatino Linotype"/>
+                <w:bCs/>
+                <w:sz w:val="20"/>
+                <w:szCs w:val="20"/>
+              </w:rPr>
+              <w:t>officer.officer</w:t>
+            </w:r>
+            <w:proofErr w:type="gramEnd"/>
+            <w:r>
+              <w:rPr>
+                <w:rFonts w:ascii="Palatino Linotype" w:hAnsi="Palatino Linotype"/>
+                <w:bCs/>
+                <w:sz w:val="20"/>
+                <w:szCs w:val="20"/>
+              </w:rPr>
+              <w:t>_type</w:t>
+            </w:r>
+            <w:proofErr w:type="spellEnd"/>
+            <w:r>
+              <w:rPr>
+                <w:rFonts w:ascii="Palatino Linotype" w:hAnsi="Palatino Linotype"/>
+                <w:bCs/>
+                <w:sz w:val="20"/>
+                <w:szCs w:val="20"/>
+              </w:rPr>
+              <w:t xml:space="preserve">  ==  ‘Magistrate’ %}Magistrate Decision</w:t>
+            </w:r>
+            <w:r>
+              <w:rPr>
+                <w:rFonts w:ascii="Palatino Linotype" w:hAnsi="Palatino Linotype"/>
+                <w:sz w:val="20"/>
+                <w:szCs w:val="20"/>
+              </w:rPr>
+              <w:t xml:space="preserve">{% </w:t>
+            </w:r>
+            <w:proofErr w:type="spellStart"/>
+            <w:r>
+              <w:rPr>
+                <w:rFonts w:ascii="Palatino Linotype" w:hAnsi="Palatino Linotype"/>
+                <w:sz w:val="20"/>
+                <w:szCs w:val="20"/>
+              </w:rPr>
+              <w:t>elif</w:t>
+            </w:r>
+            <w:proofErr w:type="spellEnd"/>
+            <w:r>
+              <w:rPr>
+                <w:rFonts w:ascii="Palatino Linotype" w:hAnsi="Palatino Linotype"/>
+                <w:sz w:val="20"/>
+                <w:szCs w:val="20"/>
+              </w:rPr>
+              <w:t xml:space="preserve"> </w:t>
+            </w:r>
+            <w:proofErr w:type="spellStart"/>
+            <w:r>
+              <w:rPr>
+                <w:rFonts w:ascii="Palatino Linotype" w:hAnsi="Palatino Linotype"/>
+                <w:sz w:val="20"/>
+                <w:szCs w:val="20"/>
+              </w:rPr>
+              <w:t>judicial_officer.officer_type</w:t>
+            </w:r>
+            <w:proofErr w:type="spellEnd"/>
+            <w:r>
+              <w:rPr>
+                <w:rFonts w:ascii="Palatino Linotype" w:hAnsi="Palatino Linotype"/>
+                <w:sz w:val="20"/>
+                <w:szCs w:val="20"/>
+              </w:rPr>
+              <w:t xml:space="preserve"> == ‘Judge’ %}Final Judgment Entry{% endif %} {{ </w:t>
+            </w:r>
+            <w:proofErr w:type="spellStart"/>
+            <w:r>
+              <w:rPr>
+                <w:rFonts w:ascii="Palatino Linotype" w:hAnsi="Palatino Linotype"/>
+                <w:sz w:val="20"/>
+                <w:szCs w:val="20"/>
+              </w:rPr>
+              <w:t>case_number</w:t>
+            </w:r>
+            <w:proofErr w:type="spellEnd"/>
+            <w:r>
+              <w:rPr>
+                <w:rFonts w:ascii="Palatino Linotype" w:hAnsi="Palatino Linotype"/>
+                <w:sz w:val="20"/>
+                <w:szCs w:val="20"/>
+              </w:rPr>
+              <w:t xml:space="preserve"> }}</w:t>
             </w:r>
           </w:p>
           <w:p>
@@ -505,7 +909,7 @@
 </file>
 
 <file path=word/footer3.xml><?xml version="1.0" encoding="utf-8"?>
-<w:ftr xmlns:wpc="http://schemas.microsoft.com/office/word/2010/wordprocessingCanvas" xmlns:cx="http://schemas.microsoft.com/office/drawing/2014/chartex" xmlns:cx1="http://schemas.microsoft.com/office/drawing/2015/9/8/chartex" xmlns:cx2="http://schemas.microsoft.com/office/drawing/2015/10/21/chartex" xmlns:cx3="http://schemas.microsoft.com/office/drawing/2016/5/9/chartex" xmlns:cx4="http://schemas.microsoft.com/office/drawing/2016/5/10/chartex" xmlns:cx5="http://schemas.microsoft.com/office/drawing/2016/5/11/chartex" xmlns:cx6="http://schemas.microsoft.com/office/drawing/2016/5/12/chartex" xmlns:cx7="http://schemas.microsoft.com/office/drawing/2016/5/13/chartex" xmlns:cx8="http://schemas.microsoft.com/office/drawing/2016/5/14/chartex" xmlns:mc="http://schemas.openxmlformats.org/markup-compatibility/2006" xmlns:aink="http://schemas.microsoft.com/office/drawing/2016/ink" xmlns:am3d="http://schemas.microsoft.com/office/drawing/2017/model3d" xmlns:o="urn:schemas-microsoft-com:office:office" xmlns:oel="http://schemas.microsoft.com/office/2019/extlst" xmlns:r="http://schemas.openxmlformats.org/officeDocument/2006/relationships" xmlns:m="http://schemas.openxmlformats.org/officeDocument/2006/math" xmlns:v="urn:schemas-microsoft-com:vml" xmlns:wp14="http://schemas.microsoft.com/office/word/2010/wordprocessingDrawing" xmlns:wp="http://schemas.openxmlformats.org/drawingml/2006/wordprocessingDrawing" xmlns:w10="urn:schemas-microsoft-com:office:word" xmlns:w="http://schemas.openxmlformats.org/wordprocessingml/2006/main" xmlns:w14="http://schemas.microsoft.com/office/word/2010/wordml" xmlns:w15="http://schemas.microsoft.com/office/word/2012/wordml" xmlns:w16cex="http://schemas.microsoft.com/office/word/2018/wordml/cex" xmlns:w16cid="http://schemas.microsoft.com/office/word/2016/wordml/cid" xmlns:w16="http://schemas.microsoft.com/office/word/2018/wordml" xmlns:w16sdtdh="http://schemas.microsoft.com/office/word/2020/wordml/sdtdatahash" xmlns:w16se="http://schemas.microsoft.com/office/word/2015/wordml/symex" xmlns:wpg="http://schemas.microsoft.com/office/word/2010/wordprocessingGroup" xmlns:wpi="http://schemas.microsoft.com/office/word/2010/wordprocessingInk" xmlns:wne="http://schemas.microsoft.com/office/word/2006/wordml" xmlns:wps="http://schemas.microsoft.com/office/word/2010/wordprocessingShape" mc:Ignorable="w14 w15 w16se w16cid w16 w16cex w16sdtdh wp14">
+<w:ftr xmlns:wpc="http://schemas.microsoft.com/office/word/2010/wordprocessingCanvas" xmlns:cx="http://schemas.microsoft.com/office/drawing/2014/chartex" xmlns:cx1="http://schemas.microsoft.com/office/drawing/2015/9/8/chartex" xmlns:cx2="http://schemas.microsoft.com/office/drawing/2015/10/21/chartex" xmlns:cx3="http://schemas.microsoft.com/office/drawing/2016/5/9/chartex" xmlns:cx4="http://schemas.microsoft.com/office/drawing/2016/5/10/chartex" xmlns:cx5="http://schemas.microsoft.com/office/drawing/2016/5/11/chartex" xmlns:cx6="http://schemas.microsoft.com/office/drawing/2016/5/12/chartex" xmlns:cx7="http://schemas.microsoft.com/office/drawing/2016/5/13/chartex" xmlns:cx8="http://schemas.microsoft.com/office/drawing/2016/5/14/chartex" xmlns:mc="http://schemas.openxmlformats.org/markup-compatibility/2006" xmlns:aink="http://schemas.microsoft.com/office/drawing/2016/ink" xmlns:am3d="http://schemas.microsoft.com/office/drawing/2017/model3d" xmlns:o="urn:schemas-microsoft-com:office:office" xmlns:r="http://schemas.openxmlformats.org/officeDocument/2006/relationships" xmlns:m="http://schemas.openxmlformats.org/officeDocument/2006/math" xmlns:v="urn:schemas-microsoft-com:vml" xmlns:wp14="http://schemas.microsoft.com/office/word/2010/wordprocessingDrawing" xmlns:wp="http://schemas.openxmlformats.org/drawingml/2006/wordprocessingDrawing" xmlns:w10="urn:schemas-microsoft-com:office:word" xmlns:w="http://schemas.openxmlformats.org/wordprocessingml/2006/main" xmlns:w14="http://schemas.microsoft.com/office/word/2010/wordml" xmlns:w15="http://schemas.microsoft.com/office/word/2012/wordml" xmlns:w16cex="http://schemas.microsoft.com/office/word/2018/wordml/cex" xmlns:w16cid="http://schemas.microsoft.com/office/word/2016/wordml/cid" xmlns:w16="http://schemas.microsoft.com/office/word/2018/wordml" xmlns:w16sdtdh="http://schemas.microsoft.com/office/word/2020/wordml/sdtdatahash" xmlns:w16se="http://schemas.microsoft.com/office/word/2015/wordml/symex" xmlns:wpg="http://schemas.microsoft.com/office/word/2010/wordprocessingGroup" xmlns:wpi="http://schemas.microsoft.com/office/word/2010/wordprocessingInk" xmlns:wne="http://schemas.microsoft.com/office/word/2006/wordml" xmlns:wps="http://schemas.microsoft.com/office/word/2010/wordprocessingShape" mc:Ignorable="w14 w15 w16se w16cid w16 w16cex w16sdtdh wp14">
   <w:p>
     <w:pPr>
       <w:pStyle w:val="Footer"/>
@@ -515,7 +919,7 @@
 </file>
 
 <file path=word/footnotes.xml><?xml version="1.0" encoding="utf-8"?>
-<w:footnotes xmlns:wpc="http://schemas.microsoft.com/office/word/2010/wordprocessingCanvas" xmlns:cx="http://schemas.microsoft.com/office/drawing/2014/chartex" xmlns:cx1="http://schemas.microsoft.com/office/drawing/2015/9/8/chartex" xmlns:cx2="http://schemas.microsoft.com/office/drawing/2015/10/21/chartex" xmlns:cx3="http://schemas.microsoft.com/office/drawing/2016/5/9/chartex" xmlns:cx4="http://schemas.microsoft.com/office/drawing/2016/5/10/chartex" xmlns:cx5="http://schemas.microsoft.com/office/drawing/2016/5/11/chartex" xmlns:cx6="http://schemas.microsoft.com/office/drawing/2016/5/12/chartex" xmlns:cx7="http://schemas.microsoft.com/office/drawing/2016/5/13/chartex" xmlns:cx8="http://schemas.microsoft.com/office/drawing/2016/5/14/chartex" xmlns:mc="http://schemas.openxmlformats.org/markup-compatibility/2006" xmlns:aink="http://schemas.microsoft.com/office/drawing/2016/ink" xmlns:am3d="http://schemas.microsoft.com/office/drawing/2017/model3d" xmlns:o="urn:schemas-microsoft-com:office:office" xmlns:oel="http://schemas.microsoft.com/office/2019/extlst" xmlns:r="http://schemas.openxmlformats.org/officeDocument/2006/relationships" xmlns:m="http://schemas.openxmlformats.org/officeDocument/2006/math" xmlns:v="urn:schemas-microsoft-com:vml" xmlns:wp14="http://schemas.microsoft.com/office/word/2010/wordprocessingDrawing" xmlns:wp="http://schemas.openxmlformats.org/drawingml/2006/wordprocessingDrawing" xmlns:w10="urn:schemas-microsoft-com:office:word" xmlns:w="http://schemas.openxmlformats.org/wordprocessingml/2006/main" xmlns:w14="http://schemas.microsoft.com/office/word/2010/wordml" xmlns:w15="http://schemas.microsoft.com/office/word/2012/wordml" xmlns:w16cex="http://schemas.microsoft.com/office/word/2018/wordml/cex" xmlns:w16cid="http://schemas.microsoft.com/office/word/2016/wordml/cid" xmlns:w16="http://schemas.microsoft.com/office/word/2018/wordml" xmlns:w16sdtdh="http://schemas.microsoft.com/office/word/2020/wordml/sdtdatahash" xmlns:w16se="http://schemas.microsoft.com/office/word/2015/wordml/symex" xmlns:wpg="http://schemas.microsoft.com/office/word/2010/wordprocessingGroup" xmlns:wpi="http://schemas.microsoft.com/office/word/2010/wordprocessingInk" xmlns:wne="http://schemas.microsoft.com/office/word/2006/wordml" xmlns:wps="http://schemas.microsoft.com/office/word/2010/wordprocessingShape" mc:Ignorable="w14 w15 w16se w16cid w16 w16cex w16sdtdh wp14">
+<w:footnotes xmlns:wpc="http://schemas.microsoft.com/office/word/2010/wordprocessingCanvas" xmlns:cx="http://schemas.microsoft.com/office/drawing/2014/chartex" xmlns:cx1="http://schemas.microsoft.com/office/drawing/2015/9/8/chartex" xmlns:cx2="http://schemas.microsoft.com/office/drawing/2015/10/21/chartex" xmlns:cx3="http://schemas.microsoft.com/office/drawing/2016/5/9/chartex" xmlns:cx4="http://schemas.microsoft.com/office/drawing/2016/5/10/chartex" xmlns:cx5="http://schemas.microsoft.com/office/drawing/2016/5/11/chartex" xmlns:cx6="http://schemas.microsoft.com/office/drawing/2016/5/12/chartex" xmlns:cx7="http://schemas.microsoft.com/office/drawing/2016/5/13/chartex" xmlns:cx8="http://schemas.microsoft.com/office/drawing/2016/5/14/chartex" xmlns:mc="http://schemas.openxmlformats.org/markup-compatibility/2006" xmlns:aink="http://schemas.microsoft.com/office/drawing/2016/ink" xmlns:am3d="http://schemas.microsoft.com/office/drawing/2017/model3d" xmlns:o="urn:schemas-microsoft-com:office:office" xmlns:r="http://schemas.openxmlformats.org/officeDocument/2006/relationships" xmlns:m="http://schemas.openxmlformats.org/officeDocument/2006/math" xmlns:v="urn:schemas-microsoft-com:vml" xmlns:wp14="http://schemas.microsoft.com/office/word/2010/wordprocessingDrawing" xmlns:wp="http://schemas.openxmlformats.org/drawingml/2006/wordprocessingDrawing" xmlns:w10="urn:schemas-microsoft-com:office:word" xmlns:w="http://schemas.openxmlformats.org/wordprocessingml/2006/main" xmlns:w14="http://schemas.microsoft.com/office/word/2010/wordml" xmlns:w15="http://schemas.microsoft.com/office/word/2012/wordml" xmlns:w16cex="http://schemas.microsoft.com/office/word/2018/wordml/cex" xmlns:w16cid="http://schemas.microsoft.com/office/word/2016/wordml/cid" xmlns:w16="http://schemas.microsoft.com/office/word/2018/wordml" xmlns:w16sdtdh="http://schemas.microsoft.com/office/word/2020/wordml/sdtdatahash" xmlns:w16se="http://schemas.microsoft.com/office/word/2015/wordml/symex" xmlns:wpg="http://schemas.microsoft.com/office/word/2010/wordprocessingGroup" xmlns:wpi="http://schemas.microsoft.com/office/word/2010/wordprocessingInk" xmlns:wne="http://schemas.microsoft.com/office/word/2006/wordml" xmlns:wps="http://schemas.microsoft.com/office/word/2010/wordprocessingShape" mc:Ignorable="w14 w15 w16se w16cid w16 w16cex w16sdtdh wp14">
   <w:footnote w:type="separator" w:id="-1">
     <w:p>
       <w:r>
@@ -534,7 +938,7 @@
 </file>
 
 <file path=word/header1.xml><?xml version="1.0" encoding="utf-8"?>
-<w:hdr xmlns:wpc="http://schemas.microsoft.com/office/word/2010/wordprocessingCanvas" xmlns:cx="http://schemas.microsoft.com/office/drawing/2014/chartex" xmlns:cx1="http://schemas.microsoft.com/office/drawing/2015/9/8/chartex" xmlns:cx2="http://schemas.microsoft.com/office/drawing/2015/10/21/chartex" xmlns:cx3="http://schemas.microsoft.com/office/drawing/2016/5/9/chartex" xmlns:cx4="http://schemas.microsoft.com/office/drawing/2016/5/10/chartex" xmlns:cx5="http://schemas.microsoft.com/office/drawing/2016/5/11/chartex" xmlns:cx6="http://schemas.microsoft.com/office/drawing/2016/5/12/chartex" xmlns:cx7="http://schemas.microsoft.com/office/drawing/2016/5/13/chartex" xmlns:cx8="http://schemas.microsoft.com/office/drawing/2016/5/14/chartex" xmlns:mc="http://schemas.openxmlformats.org/markup-compatibility/2006" xmlns:aink="http://schemas.microsoft.com/office/drawing/2016/ink" xmlns:am3d="http://schemas.microsoft.com/office/drawing/2017/model3d" xmlns:o="urn:schemas-microsoft-com:office:office" xmlns:oel="http://schemas.microsoft.com/office/2019/extlst" xmlns:r="http://schemas.openxmlformats.org/officeDocument/2006/relationships" xmlns:m="http://schemas.openxmlformats.org/officeDocument/2006/math" xmlns:v="urn:schemas-microsoft-com:vml" xmlns:wp14="http://schemas.microsoft.com/office/word/2010/wordprocessingDrawing" xmlns:wp="http://schemas.openxmlformats.org/drawingml/2006/wordprocessingDrawing" xmlns:w10="urn:schemas-microsoft-com:office:word" xmlns:w="http://schemas.openxmlformats.org/wordprocessingml/2006/main" xmlns:w14="http://schemas.microsoft.com/office/word/2010/wordml" xmlns:w15="http://schemas.microsoft.com/office/word/2012/wordml" xmlns:w16cex="http://schemas.microsoft.com/office/word/2018/wordml/cex" xmlns:w16cid="http://schemas.microsoft.com/office/word/2016/wordml/cid" xmlns:w16="http://schemas.microsoft.com/office/word/2018/wordml" xmlns:w16sdtdh="http://schemas.microsoft.com/office/word/2020/wordml/sdtdatahash" xmlns:w16se="http://schemas.microsoft.com/office/word/2015/wordml/symex" xmlns:wpg="http://schemas.microsoft.com/office/word/2010/wordprocessingGroup" xmlns:wpi="http://schemas.microsoft.com/office/word/2010/wordprocessingInk" xmlns:wne="http://schemas.microsoft.com/office/word/2006/wordml" xmlns:wps="http://schemas.microsoft.com/office/word/2010/wordprocessingShape" mc:Ignorable="w14 w15 w16se w16cid w16 w16cex w16sdtdh wp14">
+<w:hdr xmlns:wpc="http://schemas.microsoft.com/office/word/2010/wordprocessingCanvas" xmlns:cx="http://schemas.microsoft.com/office/drawing/2014/chartex" xmlns:cx1="http://schemas.microsoft.com/office/drawing/2015/9/8/chartex" xmlns:cx2="http://schemas.microsoft.com/office/drawing/2015/10/21/chartex" xmlns:cx3="http://schemas.microsoft.com/office/drawing/2016/5/9/chartex" xmlns:cx4="http://schemas.microsoft.com/office/drawing/2016/5/10/chartex" xmlns:cx5="http://schemas.microsoft.com/office/drawing/2016/5/11/chartex" xmlns:cx6="http://schemas.microsoft.com/office/drawing/2016/5/12/chartex" xmlns:cx7="http://schemas.microsoft.com/office/drawing/2016/5/13/chartex" xmlns:cx8="http://schemas.microsoft.com/office/drawing/2016/5/14/chartex" xmlns:mc="http://schemas.openxmlformats.org/markup-compatibility/2006" xmlns:aink="http://schemas.microsoft.com/office/drawing/2016/ink" xmlns:am3d="http://schemas.microsoft.com/office/drawing/2017/model3d" xmlns:o="urn:schemas-microsoft-com:office:office" xmlns:r="http://schemas.openxmlformats.org/officeDocument/2006/relationships" xmlns:m="http://schemas.openxmlformats.org/officeDocument/2006/math" xmlns:v="urn:schemas-microsoft-com:vml" xmlns:wp14="http://schemas.microsoft.com/office/word/2010/wordprocessingDrawing" xmlns:wp="http://schemas.openxmlformats.org/drawingml/2006/wordprocessingDrawing" xmlns:w10="urn:schemas-microsoft-com:office:word" xmlns:w="http://schemas.openxmlformats.org/wordprocessingml/2006/main" xmlns:w14="http://schemas.microsoft.com/office/word/2010/wordml" xmlns:w15="http://schemas.microsoft.com/office/word/2012/wordml" xmlns:w16cex="http://schemas.microsoft.com/office/word/2018/wordml/cex" xmlns:w16cid="http://schemas.microsoft.com/office/word/2016/wordml/cid" xmlns:w16="http://schemas.microsoft.com/office/word/2018/wordml" xmlns:w16sdtdh="http://schemas.microsoft.com/office/word/2020/wordml/sdtdatahash" xmlns:w16se="http://schemas.microsoft.com/office/word/2015/wordml/symex" xmlns:wpg="http://schemas.microsoft.com/office/word/2010/wordprocessingGroup" xmlns:wpi="http://schemas.microsoft.com/office/word/2010/wordprocessingInk" xmlns:wne="http://schemas.microsoft.com/office/word/2006/wordml" xmlns:wps="http://schemas.microsoft.com/office/word/2010/wordprocessingShape" mc:Ignorable="w14 w15 w16se w16cid w16 w16cex w16sdtdh wp14">
   <w:p>
     <w:pPr>
       <w:pStyle w:val="Header"/>
@@ -544,7 +948,7 @@
 </file>
 
 <file path=word/header2.xml><?xml version="1.0" encoding="utf-8"?>
-<w:hdr xmlns:wpc="http://schemas.microsoft.com/office/word/2010/wordprocessingCanvas" xmlns:cx="http://schemas.microsoft.com/office/drawing/2014/chartex" xmlns:cx1="http://schemas.microsoft.com/office/drawing/2015/9/8/chartex" xmlns:cx2="http://schemas.microsoft.com/office/drawing/2015/10/21/chartex" xmlns:cx3="http://schemas.microsoft.com/office/drawing/2016/5/9/chartex" xmlns:cx4="http://schemas.microsoft.com/office/drawing/2016/5/10/chartex" xmlns:cx5="http://schemas.microsoft.com/office/drawing/2016/5/11/chartex" xmlns:cx6="http://schemas.microsoft.com/office/drawing/2016/5/12/chartex" xmlns:cx7="http://schemas.microsoft.com/office/drawing/2016/5/13/chartex" xmlns:cx8="http://schemas.microsoft.com/office/drawing/2016/5/14/chartex" xmlns:mc="http://schemas.openxmlformats.org/markup-compatibility/2006" xmlns:aink="http://schemas.microsoft.com/office/drawing/2016/ink" xmlns:am3d="http://schemas.microsoft.com/office/drawing/2017/model3d" xmlns:o="urn:schemas-microsoft-com:office:office" xmlns:oel="http://schemas.microsoft.com/office/2019/extlst" xmlns:r="http://schemas.openxmlformats.org/officeDocument/2006/relationships" xmlns:m="http://schemas.openxmlformats.org/officeDocument/2006/math" xmlns:v="urn:schemas-microsoft-com:vml" xmlns:wp14="http://schemas.microsoft.com/office/word/2010/wordprocessingDrawing" xmlns:wp="http://schemas.openxmlformats.org/drawingml/2006/wordprocessingDrawing" xmlns:w10="urn:schemas-microsoft-com:office:word" xmlns:w="http://schemas.openxmlformats.org/wordprocessingml/2006/main" xmlns:w14="http://schemas.microsoft.com/office/word/2010/wordml" xmlns:w15="http://schemas.microsoft.com/office/word/2012/wordml" xmlns:w16cex="http://schemas.microsoft.com/office/word/2018/wordml/cex" xmlns:w16cid="http://schemas.microsoft.com/office/word/2016/wordml/cid" xmlns:w16="http://schemas.microsoft.com/office/word/2018/wordml" xmlns:w16sdtdh="http://schemas.microsoft.com/office/word/2020/wordml/sdtdatahash" xmlns:w16se="http://schemas.microsoft.com/office/word/2015/wordml/symex" xmlns:wpg="http://schemas.microsoft.com/office/word/2010/wordprocessingGroup" xmlns:wpi="http://schemas.microsoft.com/office/word/2010/wordprocessingInk" xmlns:wne="http://schemas.microsoft.com/office/word/2006/wordml" xmlns:wps="http://schemas.microsoft.com/office/word/2010/wordprocessingShape" mc:Ignorable="w14 w15 w16se w16cid w16 w16cex w16sdtdh wp14">
+<w:hdr xmlns:wpc="http://schemas.microsoft.com/office/word/2010/wordprocessingCanvas" xmlns:cx="http://schemas.microsoft.com/office/drawing/2014/chartex" xmlns:cx1="http://schemas.microsoft.com/office/drawing/2015/9/8/chartex" xmlns:cx2="http://schemas.microsoft.com/office/drawing/2015/10/21/chartex" xmlns:cx3="http://schemas.microsoft.com/office/drawing/2016/5/9/chartex" xmlns:cx4="http://schemas.microsoft.com/office/drawing/2016/5/10/chartex" xmlns:cx5="http://schemas.microsoft.com/office/drawing/2016/5/11/chartex" xmlns:cx6="http://schemas.microsoft.com/office/drawing/2016/5/12/chartex" xmlns:cx7="http://schemas.microsoft.com/office/drawing/2016/5/13/chartex" xmlns:cx8="http://schemas.microsoft.com/office/drawing/2016/5/14/chartex" xmlns:mc="http://schemas.openxmlformats.org/markup-compatibility/2006" xmlns:aink="http://schemas.microsoft.com/office/drawing/2016/ink" xmlns:am3d="http://schemas.microsoft.com/office/drawing/2017/model3d" xmlns:o="urn:schemas-microsoft-com:office:office" xmlns:r="http://schemas.openxmlformats.org/officeDocument/2006/relationships" xmlns:m="http://schemas.openxmlformats.org/officeDocument/2006/math" xmlns:v="urn:schemas-microsoft-com:vml" xmlns:wp14="http://schemas.microsoft.com/office/word/2010/wordprocessingDrawing" xmlns:wp="http://schemas.openxmlformats.org/drawingml/2006/wordprocessingDrawing" xmlns:w10="urn:schemas-microsoft-com:office:word" xmlns:w="http://schemas.openxmlformats.org/wordprocessingml/2006/main" xmlns:w14="http://schemas.microsoft.com/office/word/2010/wordml" xmlns:w15="http://schemas.microsoft.com/office/word/2012/wordml" xmlns:w16cex="http://schemas.microsoft.com/office/word/2018/wordml/cex" xmlns:w16cid="http://schemas.microsoft.com/office/word/2016/wordml/cid" xmlns:w16="http://schemas.microsoft.com/office/word/2018/wordml" xmlns:w16sdtdh="http://schemas.microsoft.com/office/word/2020/wordml/sdtdatahash" xmlns:w16se="http://schemas.microsoft.com/office/word/2015/wordml/symex" xmlns:wpg="http://schemas.microsoft.com/office/word/2010/wordprocessingGroup" xmlns:wpi="http://schemas.microsoft.com/office/word/2010/wordprocessingInk" xmlns:wne="http://schemas.microsoft.com/office/word/2006/wordml" xmlns:wps="http://schemas.microsoft.com/office/word/2010/wordprocessingShape" mc:Ignorable="w14 w15 w16se w16cid w16 w16cex w16sdtdh wp14">
   <w:p>
     <w:pPr>
       <w:pStyle w:val="Header"/>
@@ -568,7 +972,7 @@
 </file>
 
 <file path=word/header3.xml><?xml version="1.0" encoding="utf-8"?>
-<w:hdr xmlns:wpc="http://schemas.microsoft.com/office/word/2010/wordprocessingCanvas" xmlns:cx="http://schemas.microsoft.com/office/drawing/2014/chartex" xmlns:cx1="http://schemas.microsoft.com/office/drawing/2015/9/8/chartex" xmlns:cx2="http://schemas.microsoft.com/office/drawing/2015/10/21/chartex" xmlns:cx3="http://schemas.microsoft.com/office/drawing/2016/5/9/chartex" xmlns:cx4="http://schemas.microsoft.com/office/drawing/2016/5/10/chartex" xmlns:cx5="http://schemas.microsoft.com/office/drawing/2016/5/11/chartex" xmlns:cx6="http://schemas.microsoft.com/office/drawing/2016/5/12/chartex" xmlns:cx7="http://schemas.microsoft.com/office/drawing/2016/5/13/chartex" xmlns:cx8="http://schemas.microsoft.com/office/drawing/2016/5/14/chartex" xmlns:mc="http://schemas.openxmlformats.org/markup-compatibility/2006" xmlns:aink="http://schemas.microsoft.com/office/drawing/2016/ink" xmlns:am3d="http://schemas.microsoft.com/office/drawing/2017/model3d" xmlns:o="urn:schemas-microsoft-com:office:office" xmlns:oel="http://schemas.microsoft.com/office/2019/extlst" xmlns:r="http://schemas.openxmlformats.org/officeDocument/2006/relationships" xmlns:m="http://schemas.openxmlformats.org/officeDocument/2006/math" xmlns:v="urn:schemas-microsoft-com:vml" xmlns:wp14="http://schemas.microsoft.com/office/word/2010/wordprocessingDrawing" xmlns:wp="http://schemas.openxmlformats.org/drawingml/2006/wordprocessingDrawing" xmlns:w10="urn:schemas-microsoft-com:office:word" xmlns:w="http://schemas.openxmlformats.org/wordprocessingml/2006/main" xmlns:w14="http://schemas.microsoft.com/office/word/2010/wordml" xmlns:w15="http://schemas.microsoft.com/office/word/2012/wordml" xmlns:w16cex="http://schemas.microsoft.com/office/word/2018/wordml/cex" xmlns:w16cid="http://schemas.microsoft.com/office/word/2016/wordml/cid" xmlns:w16="http://schemas.microsoft.com/office/word/2018/wordml" xmlns:w16sdtdh="http://schemas.microsoft.com/office/word/2020/wordml/sdtdatahash" xmlns:w16se="http://schemas.microsoft.com/office/word/2015/wordml/symex" xmlns:wpg="http://schemas.microsoft.com/office/word/2010/wordprocessingGroup" xmlns:wpi="http://schemas.microsoft.com/office/word/2010/wordprocessingInk" xmlns:wne="http://schemas.microsoft.com/office/word/2006/wordml" xmlns:wps="http://schemas.microsoft.com/office/word/2010/wordprocessingShape" mc:Ignorable="w14 w15 w16se w16cid w16 w16cex w16sdtdh wp14">
+<w:hdr xmlns:wpc="http://schemas.microsoft.com/office/word/2010/wordprocessingCanvas" xmlns:cx="http://schemas.microsoft.com/office/drawing/2014/chartex" xmlns:cx1="http://schemas.microsoft.com/office/drawing/2015/9/8/chartex" xmlns:cx2="http://schemas.microsoft.com/office/drawing/2015/10/21/chartex" xmlns:cx3="http://schemas.microsoft.com/office/drawing/2016/5/9/chartex" xmlns:cx4="http://schemas.microsoft.com/office/drawing/2016/5/10/chartex" xmlns:cx5="http://schemas.microsoft.com/office/drawing/2016/5/11/chartex" xmlns:cx6="http://schemas.microsoft.com/office/drawing/2016/5/12/chartex" xmlns:cx7="http://schemas.microsoft.com/office/drawing/2016/5/13/chartex" xmlns:cx8="http://schemas.microsoft.com/office/drawing/2016/5/14/chartex" xmlns:mc="http://schemas.openxmlformats.org/markup-compatibility/2006" xmlns:aink="http://schemas.microsoft.com/office/drawing/2016/ink" xmlns:am3d="http://schemas.microsoft.com/office/drawing/2017/model3d" xmlns:o="urn:schemas-microsoft-com:office:office" xmlns:r="http://schemas.openxmlformats.org/officeDocument/2006/relationships" xmlns:m="http://schemas.openxmlformats.org/officeDocument/2006/math" xmlns:v="urn:schemas-microsoft-com:vml" xmlns:wp14="http://schemas.microsoft.com/office/word/2010/wordprocessingDrawing" xmlns:wp="http://schemas.openxmlformats.org/drawingml/2006/wordprocessingDrawing" xmlns:w10="urn:schemas-microsoft-com:office:word" xmlns:w="http://schemas.openxmlformats.org/wordprocessingml/2006/main" xmlns:w14="http://schemas.microsoft.com/office/word/2010/wordml" xmlns:w15="http://schemas.microsoft.com/office/word/2012/wordml" xmlns:w16cex="http://schemas.microsoft.com/office/word/2018/wordml/cex" xmlns:w16cid="http://schemas.microsoft.com/office/word/2016/wordml/cid" xmlns:w16="http://schemas.microsoft.com/office/word/2018/wordml" xmlns:w16sdtdh="http://schemas.microsoft.com/office/word/2020/wordml/sdtdatahash" xmlns:w16se="http://schemas.microsoft.com/office/word/2015/wordml/symex" xmlns:wpg="http://schemas.microsoft.com/office/word/2010/wordprocessingGroup" xmlns:wpi="http://schemas.microsoft.com/office/word/2010/wordprocessingInk" xmlns:wne="http://schemas.microsoft.com/office/word/2006/wordml" xmlns:wps="http://schemas.microsoft.com/office/word/2010/wordprocessingShape" mc:Ignorable="w14 w15 w16se w16cid w16 w16cex w16sdtdh wp14">
   <w:p>
     <w:pPr>
       <w:pStyle w:val="Header"/>

</xml_diff>